<commit_message>
update api_routes and docx_template_update to include all the detectors
</commit_message>
<xml_diff>
--- a/updated_syllabus_detector_common_template.docx
+++ b/updated_syllabus_detector_common_template.docx
@@ -105,7 +105,29 @@
           <w:sz w:val="40"/>
           <w:szCs w:val="40"/>
         </w:rPr>
-        <w:t>COURSE SYLLABUS</w:t>
+        <w:t>{{</w:t>
+      </w:r>
+      <w:proofErr w:type="spellStart"/>
+      <w:r>
+        <w:rPr>
+          <w:rFonts w:cstheme="majorHAnsi"/>
+          <w:b/>
+          <w:bCs/>
+          <w:sz w:val="40"/>
+          <w:szCs w:val="40"/>
+        </w:rPr>
+        <w:t>course_title</w:t>
+      </w:r>
+      <w:proofErr w:type="spellEnd"/>
+      <w:r>
+        <w:rPr>
+          <w:rFonts w:cstheme="majorHAnsi"/>
+          <w:b/>
+          <w:bCs/>
+          <w:sz w:val="40"/>
+          <w:szCs w:val="40"/>
+        </w:rPr>
+        <w:t>}}</w:t>
       </w:r>
     </w:p>
     <w:p>
@@ -167,7 +189,25 @@
           <w:sz w:val="24"/>
           <w:szCs w:val="24"/>
         </w:rPr>
-        <w:t>{{instructor_name}}</w:t>
+        <w:t>{{</w:t>
+      </w:r>
+      <w:proofErr w:type="spellStart"/>
+      <w:r>
+        <w:rPr>
+          <w:rFonts w:asciiTheme="majorHAnsi" w:hAnsiTheme="majorHAnsi" w:cstheme="majorHAnsi"/>
+          <w:sz w:val="24"/>
+          <w:szCs w:val="24"/>
+        </w:rPr>
+        <w:t>instructor_name</w:t>
+      </w:r>
+      <w:proofErr w:type="spellEnd"/>
+      <w:r>
+        <w:rPr>
+          <w:rFonts w:asciiTheme="majorHAnsi" w:hAnsiTheme="majorHAnsi" w:cstheme="majorHAnsi"/>
+          <w:sz w:val="24"/>
+          <w:szCs w:val="24"/>
+        </w:rPr>
+        <w:t>}}</w:t>
       </w:r>
     </w:p>
     <w:p>
@@ -193,7 +233,25 @@
           <w:sz w:val="24"/>
           <w:szCs w:val="24"/>
         </w:rPr>
-        <w:t>{{instructor_title}}</w:t>
+        <w:t>{{</w:t>
+      </w:r>
+      <w:proofErr w:type="spellStart"/>
+      <w:r>
+        <w:rPr>
+          <w:rFonts w:asciiTheme="majorHAnsi" w:hAnsiTheme="majorHAnsi" w:cstheme="majorHAnsi"/>
+          <w:sz w:val="24"/>
+          <w:szCs w:val="24"/>
+        </w:rPr>
+        <w:t>instructor_title</w:t>
+      </w:r>
+      <w:proofErr w:type="spellEnd"/>
+      <w:r>
+        <w:rPr>
+          <w:rFonts w:asciiTheme="majorHAnsi" w:hAnsiTheme="majorHAnsi" w:cstheme="majorHAnsi"/>
+          <w:sz w:val="24"/>
+          <w:szCs w:val="24"/>
+        </w:rPr>
+        <w:t>}}</w:t>
       </w:r>
     </w:p>
     <w:p>
@@ -219,7 +277,25 @@
           <w:sz w:val="24"/>
           <w:szCs w:val="24"/>
         </w:rPr>
-        <w:t>{{instructor_department}}</w:t>
+        <w:t>{{</w:t>
+      </w:r>
+      <w:proofErr w:type="spellStart"/>
+      <w:r>
+        <w:rPr>
+          <w:rFonts w:asciiTheme="majorHAnsi" w:hAnsiTheme="majorHAnsi" w:cstheme="majorHAnsi"/>
+          <w:sz w:val="24"/>
+          <w:szCs w:val="24"/>
+        </w:rPr>
+        <w:t>instructor_department</w:t>
+      </w:r>
+      <w:proofErr w:type="spellEnd"/>
+      <w:r>
+        <w:rPr>
+          <w:rFonts w:asciiTheme="majorHAnsi" w:hAnsiTheme="majorHAnsi" w:cstheme="majorHAnsi"/>
+          <w:sz w:val="24"/>
+          <w:szCs w:val="24"/>
+        </w:rPr>
+        <w:t>}}</w:t>
       </w:r>
     </w:p>
     <w:p>
@@ -271,7 +347,25 @@
           <w:sz w:val="24"/>
           <w:szCs w:val="24"/>
         </w:rPr>
-        <w:t>{{preferred_contact_method}}</w:t>
+        <w:t>{{</w:t>
+      </w:r>
+      <w:proofErr w:type="spellStart"/>
+      <w:r>
+        <w:rPr>
+          <w:rFonts w:asciiTheme="majorHAnsi" w:hAnsiTheme="majorHAnsi" w:cstheme="majorHAnsi"/>
+          <w:sz w:val="24"/>
+          <w:szCs w:val="24"/>
+        </w:rPr>
+        <w:t>preferred_contact_method</w:t>
+      </w:r>
+      <w:proofErr w:type="spellEnd"/>
+      <w:r>
+        <w:rPr>
+          <w:rFonts w:asciiTheme="majorHAnsi" w:hAnsiTheme="majorHAnsi" w:cstheme="majorHAnsi"/>
+          <w:sz w:val="24"/>
+          <w:szCs w:val="24"/>
+        </w:rPr>
+        <w:t>}}</w:t>
       </w:r>
     </w:p>
     <w:p>
@@ -297,7 +391,25 @@
           <w:sz w:val="24"/>
           <w:szCs w:val="24"/>
         </w:rPr>
-        <w:t>{{response_time}}</w:t>
+        <w:t>{{</w:t>
+      </w:r>
+      <w:proofErr w:type="spellStart"/>
+      <w:r>
+        <w:rPr>
+          <w:rFonts w:asciiTheme="majorHAnsi" w:hAnsiTheme="majorHAnsi" w:cstheme="majorHAnsi"/>
+          <w:sz w:val="24"/>
+          <w:szCs w:val="24"/>
+        </w:rPr>
+        <w:t>response_time</w:t>
+      </w:r>
+      <w:proofErr w:type="spellEnd"/>
+      <w:r>
+        <w:rPr>
+          <w:rFonts w:asciiTheme="majorHAnsi" w:hAnsiTheme="majorHAnsi" w:cstheme="majorHAnsi"/>
+          <w:sz w:val="24"/>
+          <w:szCs w:val="24"/>
+        </w:rPr>
+        <w:t>}}</w:t>
       </w:r>
     </w:p>
     <w:p>
@@ -341,7 +453,25 @@
           <w:sz w:val="24"/>
           <w:szCs w:val="24"/>
         </w:rPr>
-        <w:t>{{office_address}}</w:t>
+        <w:t>{{</w:t>
+      </w:r>
+      <w:proofErr w:type="spellStart"/>
+      <w:r>
+        <w:rPr>
+          <w:rFonts w:asciiTheme="majorHAnsi" w:hAnsiTheme="majorHAnsi" w:cstheme="majorHAnsi"/>
+          <w:sz w:val="24"/>
+          <w:szCs w:val="24"/>
+        </w:rPr>
+        <w:t>office_address</w:t>
+      </w:r>
+      <w:proofErr w:type="spellEnd"/>
+      <w:r>
+        <w:rPr>
+          <w:rFonts w:asciiTheme="majorHAnsi" w:hAnsiTheme="majorHAnsi" w:cstheme="majorHAnsi"/>
+          <w:sz w:val="24"/>
+          <w:szCs w:val="24"/>
+        </w:rPr>
+        <w:t>}}</w:t>
       </w:r>
     </w:p>
     <w:p>
@@ -367,7 +497,25 @@
           <w:sz w:val="24"/>
           <w:szCs w:val="24"/>
         </w:rPr>
-        <w:t>{{office_phone}}</w:t>
+        <w:t>{{</w:t>
+      </w:r>
+      <w:proofErr w:type="spellStart"/>
+      <w:r>
+        <w:rPr>
+          <w:rFonts w:asciiTheme="majorHAnsi" w:hAnsiTheme="majorHAnsi" w:cstheme="majorHAnsi"/>
+          <w:sz w:val="24"/>
+          <w:szCs w:val="24"/>
+        </w:rPr>
+        <w:t>office_phone</w:t>
+      </w:r>
+      <w:proofErr w:type="spellEnd"/>
+      <w:r>
+        <w:rPr>
+          <w:rFonts w:asciiTheme="majorHAnsi" w:hAnsiTheme="majorHAnsi" w:cstheme="majorHAnsi"/>
+          <w:sz w:val="24"/>
+          <w:szCs w:val="24"/>
+        </w:rPr>
+        <w:t>}}</w:t>
       </w:r>
     </w:p>
     <w:p>
@@ -393,7 +541,25 @@
           <w:sz w:val="24"/>
           <w:szCs w:val="24"/>
         </w:rPr>
-        <w:t>{{office_hours}}</w:t>
+        <w:t>{{</w:t>
+      </w:r>
+      <w:proofErr w:type="spellStart"/>
+      <w:r>
+        <w:rPr>
+          <w:rFonts w:asciiTheme="majorHAnsi" w:hAnsiTheme="majorHAnsi" w:cstheme="majorHAnsi"/>
+          <w:sz w:val="24"/>
+          <w:szCs w:val="24"/>
+        </w:rPr>
+        <w:t>office_hours</w:t>
+      </w:r>
+      <w:proofErr w:type="spellEnd"/>
+      <w:r>
+        <w:rPr>
+          <w:rFonts w:asciiTheme="majorHAnsi" w:hAnsiTheme="majorHAnsi" w:cstheme="majorHAnsi"/>
+          <w:sz w:val="24"/>
+          <w:szCs w:val="24"/>
+        </w:rPr>
+        <w:t>}}</w:t>
       </w:r>
     </w:p>
     <w:p>
@@ -463,7 +629,25 @@
           <w:sz w:val="24"/>
           <w:szCs w:val="24"/>
         </w:rPr>
-        <w:t>{{class_location}}</w:t>
+        <w:t>{{</w:t>
+      </w:r>
+      <w:proofErr w:type="spellStart"/>
+      <w:r>
+        <w:rPr>
+          <w:rFonts w:asciiTheme="majorHAnsi" w:hAnsiTheme="majorHAnsi" w:cstheme="majorHAnsi"/>
+          <w:sz w:val="24"/>
+          <w:szCs w:val="24"/>
+        </w:rPr>
+        <w:t>class_location</w:t>
+      </w:r>
+      <w:proofErr w:type="spellEnd"/>
+      <w:r>
+        <w:rPr>
+          <w:rFonts w:asciiTheme="majorHAnsi" w:hAnsiTheme="majorHAnsi" w:cstheme="majorHAnsi"/>
+          <w:sz w:val="24"/>
+          <w:szCs w:val="24"/>
+        </w:rPr>
+        <w:t>}}</w:t>
       </w:r>
     </w:p>
     <w:p>
@@ -507,7 +691,25 @@
           <w:sz w:val="24"/>
           <w:szCs w:val="24"/>
         </w:rPr>
-        <w:t>{{assignment_types_title}}</w:t>
+        <w:t>{{</w:t>
+      </w:r>
+      <w:proofErr w:type="spellStart"/>
+      <w:r>
+        <w:rPr>
+          <w:rFonts w:asciiTheme="majorHAnsi" w:hAnsiTheme="majorHAnsi" w:cstheme="majorHAnsi"/>
+          <w:sz w:val="24"/>
+          <w:szCs w:val="24"/>
+        </w:rPr>
+        <w:t>assignment_types_title</w:t>
+      </w:r>
+      <w:proofErr w:type="spellEnd"/>
+      <w:r>
+        <w:rPr>
+          <w:rFonts w:asciiTheme="majorHAnsi" w:hAnsiTheme="majorHAnsi" w:cstheme="majorHAnsi"/>
+          <w:sz w:val="24"/>
+          <w:szCs w:val="24"/>
+        </w:rPr>
+        <w:t>}}</w:t>
       </w:r>
     </w:p>
     <w:p>
@@ -534,7 +736,25 @@
           <w:sz w:val="24"/>
           <w:szCs w:val="24"/>
         </w:rPr>
-        <w:t>{{assignment_delivery}}</w:t>
+        <w:t>{{</w:t>
+      </w:r>
+      <w:proofErr w:type="spellStart"/>
+      <w:r>
+        <w:rPr>
+          <w:rFonts w:asciiTheme="majorHAnsi" w:hAnsiTheme="majorHAnsi" w:cstheme="majorHAnsi"/>
+          <w:sz w:val="24"/>
+          <w:szCs w:val="24"/>
+        </w:rPr>
+        <w:t>assignment_delivery</w:t>
+      </w:r>
+      <w:proofErr w:type="spellEnd"/>
+      <w:r>
+        <w:rPr>
+          <w:rFonts w:asciiTheme="majorHAnsi" w:hAnsiTheme="majorHAnsi" w:cstheme="majorHAnsi"/>
+          <w:sz w:val="24"/>
+          <w:szCs w:val="24"/>
+        </w:rPr>
+        <w:t>}}</w:t>
       </w:r>
     </w:p>
     <w:p>
@@ -560,7 +780,25 @@
           <w:sz w:val="24"/>
           <w:szCs w:val="24"/>
         </w:rPr>
-        <w:t>{{deadline_expectations_title}}</w:t>
+        <w:t>{{</w:t>
+      </w:r>
+      <w:proofErr w:type="spellStart"/>
+      <w:r>
+        <w:rPr>
+          <w:rFonts w:asciiTheme="majorHAnsi" w:hAnsiTheme="majorHAnsi" w:cstheme="majorHAnsi"/>
+          <w:sz w:val="24"/>
+          <w:szCs w:val="24"/>
+        </w:rPr>
+        <w:t>deadline_expectations_title</w:t>
+      </w:r>
+      <w:proofErr w:type="spellEnd"/>
+      <w:r>
+        <w:rPr>
+          <w:rFonts w:asciiTheme="majorHAnsi" w:hAnsiTheme="majorHAnsi" w:cstheme="majorHAnsi"/>
+          <w:sz w:val="24"/>
+          <w:szCs w:val="24"/>
+        </w:rPr>
+        <w:t>}}</w:t>
       </w:r>
     </w:p>
     <w:p>
@@ -630,7 +868,25 @@
           <w:sz w:val="24"/>
           <w:szCs w:val="24"/>
         </w:rPr>
-        <w:t>{{credit_hour}}</w:t>
+        <w:t>{{</w:t>
+      </w:r>
+      <w:proofErr w:type="spellStart"/>
+      <w:r>
+        <w:rPr>
+          <w:rFonts w:asciiTheme="majorHAnsi" w:hAnsiTheme="majorHAnsi" w:cstheme="majorHAnsi"/>
+          <w:sz w:val="24"/>
+          <w:szCs w:val="24"/>
+        </w:rPr>
+        <w:t>credit_hour</w:t>
+      </w:r>
+      <w:proofErr w:type="spellEnd"/>
+      <w:r>
+        <w:rPr>
+          <w:rFonts w:asciiTheme="majorHAnsi" w:hAnsiTheme="majorHAnsi" w:cstheme="majorHAnsi"/>
+          <w:sz w:val="24"/>
+          <w:szCs w:val="24"/>
+        </w:rPr>
+        <w:t>}}</w:t>
       </w:r>
     </w:p>
     <w:p>
@@ -700,7 +956,25 @@
           <w:sz w:val="24"/>
           <w:szCs w:val="24"/>
         </w:rPr>
-        <w:t>{{final_grade_scale}}</w:t>
+        <w:t>{{</w:t>
+      </w:r>
+      <w:proofErr w:type="spellStart"/>
+      <w:r>
+        <w:rPr>
+          <w:rFonts w:asciiTheme="majorHAnsi" w:hAnsiTheme="majorHAnsi" w:cstheme="majorHAnsi"/>
+          <w:sz w:val="24"/>
+          <w:szCs w:val="24"/>
+        </w:rPr>
+        <w:t>final_grade_scale</w:t>
+      </w:r>
+      <w:proofErr w:type="spellEnd"/>
+      <w:r>
+        <w:rPr>
+          <w:rFonts w:asciiTheme="majorHAnsi" w:hAnsiTheme="majorHAnsi" w:cstheme="majorHAnsi"/>
+          <w:sz w:val="24"/>
+          <w:szCs w:val="24"/>
+        </w:rPr>
+        <w:t>}}</w:t>
       </w:r>
     </w:p>
     <w:p>
@@ -726,7 +1000,25 @@
           <w:sz w:val="24"/>
           <w:szCs w:val="24"/>
         </w:rPr>
-        <w:t>{{grading_process}}</w:t>
+        <w:t>{{</w:t>
+      </w:r>
+      <w:proofErr w:type="spellStart"/>
+      <w:r>
+        <w:rPr>
+          <w:rFonts w:asciiTheme="majorHAnsi" w:hAnsiTheme="majorHAnsi" w:cstheme="majorHAnsi"/>
+          <w:sz w:val="24"/>
+          <w:szCs w:val="24"/>
+        </w:rPr>
+        <w:t>grading_process</w:t>
+      </w:r>
+      <w:proofErr w:type="spellEnd"/>
+      <w:r>
+        <w:rPr>
+          <w:rFonts w:asciiTheme="majorHAnsi" w:hAnsiTheme="majorHAnsi" w:cstheme="majorHAnsi"/>
+          <w:sz w:val="24"/>
+          <w:szCs w:val="24"/>
+        </w:rPr>
+        <w:t>}}</w:t>
       </w:r>
     </w:p>
     <w:p>

</xml_diff>

<commit_message>
standardize template headings and checker label formatting
</commit_message>
<xml_diff>
--- a/updated_syllabus_detector_common_template.docx
+++ b/updated_syllabus_detector_common_template.docx
@@ -132,24 +132,6 @@
     </w:p>
     <w:p>
       <w:pPr>
-        <w:rPr>
-          <w:rFonts w:asciiTheme="majorHAnsi" w:hAnsiTheme="majorHAnsi" w:cstheme="majorHAnsi"/>
-          <w:sz w:val="24"/>
-          <w:szCs w:val="24"/>
-        </w:rPr>
-      </w:pPr>
-      <w:r>
-        <w:rPr>
-          <w:rFonts w:asciiTheme="majorHAnsi" w:hAnsiTheme="majorHAnsi" w:cstheme="majorHAnsi"/>
-          <w:i/>
-          <w:sz w:val="24"/>
-          <w:szCs w:val="24"/>
-        </w:rPr>
-        <w:t>Source File: {{filename}}</w:t>
-      </w:r>
-    </w:p>
-    <w:p>
-      <w:pPr>
         <w:pStyle w:val="Heading1"/>
         <w:rPr>
           <w:rFonts w:cstheme="majorHAnsi"/>
@@ -169,43 +151,33 @@
     <w:p>
       <w:pPr>
         <w:rPr>
-          <w:rFonts w:asciiTheme="majorHAnsi" w:hAnsiTheme="majorHAnsi" w:cstheme="majorHAnsi"/>
-          <w:sz w:val="24"/>
-          <w:szCs w:val="24"/>
+          <w:rFonts w:cs="Calibri"/>
         </w:rPr>
       </w:pPr>
       <w:r>
         <w:rPr>
-          <w:rFonts w:asciiTheme="majorHAnsi" w:hAnsiTheme="majorHAnsi" w:cstheme="majorHAnsi"/>
+          <w:rFonts w:cs="Calibri"/>
           <w:b/>
-          <w:sz w:val="24"/>
-          <w:szCs w:val="24"/>
         </w:rPr>
         <w:t xml:space="preserve">Instructor Name: </w:t>
       </w:r>
       <w:r>
         <w:rPr>
-          <w:rFonts w:asciiTheme="majorHAnsi" w:hAnsiTheme="majorHAnsi" w:cstheme="majorHAnsi"/>
-          <w:sz w:val="24"/>
-          <w:szCs w:val="24"/>
+          <w:rFonts w:cs="Calibri"/>
         </w:rPr>
         <w:t>{{</w:t>
       </w:r>
       <w:proofErr w:type="spellStart"/>
       <w:r>
         <w:rPr>
-          <w:rFonts w:asciiTheme="majorHAnsi" w:hAnsiTheme="majorHAnsi" w:cstheme="majorHAnsi"/>
-          <w:sz w:val="24"/>
-          <w:szCs w:val="24"/>
+          <w:rFonts w:cs="Calibri"/>
         </w:rPr>
         <w:t>instructor_name</w:t>
       </w:r>
       <w:proofErr w:type="spellEnd"/>
       <w:r>
         <w:rPr>
-          <w:rFonts w:asciiTheme="majorHAnsi" w:hAnsiTheme="majorHAnsi" w:cstheme="majorHAnsi"/>
-          <w:sz w:val="24"/>
-          <w:szCs w:val="24"/>
+          <w:rFonts w:cs="Calibri"/>
         </w:rPr>
         <w:t>}}</w:t>
       </w:r>
@@ -213,43 +185,33 @@
     <w:p>
       <w:pPr>
         <w:rPr>
-          <w:rFonts w:asciiTheme="majorHAnsi" w:hAnsiTheme="majorHAnsi" w:cstheme="majorHAnsi"/>
-          <w:sz w:val="24"/>
-          <w:szCs w:val="24"/>
+          <w:rFonts w:cs="Calibri"/>
         </w:rPr>
       </w:pPr>
       <w:r>
         <w:rPr>
-          <w:rFonts w:asciiTheme="majorHAnsi" w:hAnsiTheme="majorHAnsi" w:cstheme="majorHAnsi"/>
+          <w:rFonts w:cs="Calibri"/>
           <w:b/>
-          <w:sz w:val="24"/>
-          <w:szCs w:val="24"/>
         </w:rPr>
         <w:t xml:space="preserve">Instructor Title: </w:t>
       </w:r>
       <w:r>
         <w:rPr>
-          <w:rFonts w:asciiTheme="majorHAnsi" w:hAnsiTheme="majorHAnsi" w:cstheme="majorHAnsi"/>
-          <w:sz w:val="24"/>
-          <w:szCs w:val="24"/>
+          <w:rFonts w:cs="Calibri"/>
         </w:rPr>
         <w:t>{{</w:t>
       </w:r>
       <w:proofErr w:type="spellStart"/>
       <w:r>
         <w:rPr>
-          <w:rFonts w:asciiTheme="majorHAnsi" w:hAnsiTheme="majorHAnsi" w:cstheme="majorHAnsi"/>
-          <w:sz w:val="24"/>
-          <w:szCs w:val="24"/>
+          <w:rFonts w:cs="Calibri"/>
         </w:rPr>
         <w:t>instructor_title</w:t>
       </w:r>
       <w:proofErr w:type="spellEnd"/>
       <w:r>
         <w:rPr>
-          <w:rFonts w:asciiTheme="majorHAnsi" w:hAnsiTheme="majorHAnsi" w:cstheme="majorHAnsi"/>
-          <w:sz w:val="24"/>
-          <w:szCs w:val="24"/>
+          <w:rFonts w:cs="Calibri"/>
         </w:rPr>
         <w:t>}}</w:t>
       </w:r>
@@ -257,43 +219,33 @@
     <w:p>
       <w:pPr>
         <w:rPr>
-          <w:rFonts w:asciiTheme="majorHAnsi" w:hAnsiTheme="majorHAnsi" w:cstheme="majorHAnsi"/>
-          <w:sz w:val="24"/>
-          <w:szCs w:val="24"/>
+          <w:rFonts w:cs="Calibri"/>
         </w:rPr>
       </w:pPr>
       <w:r>
         <w:rPr>
-          <w:rFonts w:asciiTheme="majorHAnsi" w:hAnsiTheme="majorHAnsi" w:cstheme="majorHAnsi"/>
+          <w:rFonts w:cs="Calibri"/>
           <w:b/>
-          <w:sz w:val="24"/>
-          <w:szCs w:val="24"/>
         </w:rPr>
         <w:t xml:space="preserve">Instructor Department: </w:t>
       </w:r>
       <w:r>
         <w:rPr>
-          <w:rFonts w:asciiTheme="majorHAnsi" w:hAnsiTheme="majorHAnsi" w:cstheme="majorHAnsi"/>
-          <w:sz w:val="24"/>
-          <w:szCs w:val="24"/>
+          <w:rFonts w:cs="Calibri"/>
         </w:rPr>
         <w:t>{{</w:t>
       </w:r>
       <w:proofErr w:type="spellStart"/>
       <w:r>
         <w:rPr>
-          <w:rFonts w:asciiTheme="majorHAnsi" w:hAnsiTheme="majorHAnsi" w:cstheme="majorHAnsi"/>
-          <w:sz w:val="24"/>
-          <w:szCs w:val="24"/>
+          <w:rFonts w:cs="Calibri"/>
         </w:rPr>
         <w:t>instructor_department</w:t>
       </w:r>
       <w:proofErr w:type="spellEnd"/>
       <w:r>
         <w:rPr>
-          <w:rFonts w:asciiTheme="majorHAnsi" w:hAnsiTheme="majorHAnsi" w:cstheme="majorHAnsi"/>
-          <w:sz w:val="24"/>
-          <w:szCs w:val="24"/>
+          <w:rFonts w:cs="Calibri"/>
         </w:rPr>
         <w:t>}}</w:t>
       </w:r>
@@ -301,25 +253,19 @@
     <w:p>
       <w:pPr>
         <w:rPr>
-          <w:rFonts w:asciiTheme="majorHAnsi" w:hAnsiTheme="majorHAnsi" w:cstheme="majorHAnsi"/>
-          <w:sz w:val="24"/>
-          <w:szCs w:val="24"/>
+          <w:rFonts w:cs="Calibri"/>
         </w:rPr>
       </w:pPr>
       <w:r>
         <w:rPr>
-          <w:rFonts w:asciiTheme="majorHAnsi" w:hAnsiTheme="majorHAnsi" w:cstheme="majorHAnsi"/>
+          <w:rFonts w:cs="Calibri"/>
           <w:b/>
-          <w:sz w:val="24"/>
-          <w:szCs w:val="24"/>
         </w:rPr>
         <w:t xml:space="preserve">Instructor Email: </w:t>
       </w:r>
       <w:r>
         <w:rPr>
-          <w:rFonts w:asciiTheme="majorHAnsi" w:hAnsiTheme="majorHAnsi" w:cstheme="majorHAnsi"/>
-          <w:sz w:val="24"/>
-          <w:szCs w:val="24"/>
+          <w:rFonts w:cs="Calibri"/>
         </w:rPr>
         <w:t>{{email}}</w:t>
       </w:r>
@@ -327,43 +273,33 @@
     <w:p>
       <w:pPr>
         <w:rPr>
-          <w:rFonts w:asciiTheme="majorHAnsi" w:hAnsiTheme="majorHAnsi" w:cstheme="majorHAnsi"/>
-          <w:sz w:val="24"/>
-          <w:szCs w:val="24"/>
+          <w:rFonts w:cs="Calibri"/>
         </w:rPr>
       </w:pPr>
       <w:r>
         <w:rPr>
-          <w:rFonts w:asciiTheme="majorHAnsi" w:hAnsiTheme="majorHAnsi" w:cstheme="majorHAnsi"/>
+          <w:rFonts w:cs="Calibri"/>
           <w:b/>
-          <w:sz w:val="24"/>
-          <w:szCs w:val="24"/>
         </w:rPr>
         <w:t xml:space="preserve">Preferred Contact Method: </w:t>
       </w:r>
       <w:r>
         <w:rPr>
-          <w:rFonts w:asciiTheme="majorHAnsi" w:hAnsiTheme="majorHAnsi" w:cstheme="majorHAnsi"/>
-          <w:sz w:val="24"/>
-          <w:szCs w:val="24"/>
+          <w:rFonts w:cs="Calibri"/>
         </w:rPr>
         <w:t>{{</w:t>
       </w:r>
       <w:proofErr w:type="spellStart"/>
       <w:r>
         <w:rPr>
-          <w:rFonts w:asciiTheme="majorHAnsi" w:hAnsiTheme="majorHAnsi" w:cstheme="majorHAnsi"/>
-          <w:sz w:val="24"/>
-          <w:szCs w:val="24"/>
+          <w:rFonts w:cs="Calibri"/>
         </w:rPr>
         <w:t>preferred_contact_method</w:t>
       </w:r>
       <w:proofErr w:type="spellEnd"/>
       <w:r>
         <w:rPr>
-          <w:rFonts w:asciiTheme="majorHAnsi" w:hAnsiTheme="majorHAnsi" w:cstheme="majorHAnsi"/>
-          <w:sz w:val="24"/>
-          <w:szCs w:val="24"/>
+          <w:rFonts w:cs="Calibri"/>
         </w:rPr>
         <w:t>}}</w:t>
       </w:r>
@@ -371,43 +307,33 @@
     <w:p>
       <w:pPr>
         <w:rPr>
-          <w:rFonts w:asciiTheme="majorHAnsi" w:hAnsiTheme="majorHAnsi" w:cstheme="majorHAnsi"/>
-          <w:sz w:val="24"/>
-          <w:szCs w:val="24"/>
+          <w:rFonts w:cs="Calibri"/>
         </w:rPr>
       </w:pPr>
       <w:r>
         <w:rPr>
-          <w:rFonts w:asciiTheme="majorHAnsi" w:hAnsiTheme="majorHAnsi" w:cstheme="majorHAnsi"/>
+          <w:rFonts w:cs="Calibri"/>
           <w:b/>
-          <w:sz w:val="24"/>
-          <w:szCs w:val="24"/>
         </w:rPr>
         <w:t xml:space="preserve">Response Time Expectation: </w:t>
       </w:r>
       <w:r>
         <w:rPr>
-          <w:rFonts w:asciiTheme="majorHAnsi" w:hAnsiTheme="majorHAnsi" w:cstheme="majorHAnsi"/>
-          <w:sz w:val="24"/>
-          <w:szCs w:val="24"/>
+          <w:rFonts w:cs="Calibri"/>
         </w:rPr>
         <w:t>{{</w:t>
       </w:r>
       <w:proofErr w:type="spellStart"/>
       <w:r>
         <w:rPr>
-          <w:rFonts w:asciiTheme="majorHAnsi" w:hAnsiTheme="majorHAnsi" w:cstheme="majorHAnsi"/>
-          <w:sz w:val="24"/>
-          <w:szCs w:val="24"/>
+          <w:rFonts w:cs="Calibri"/>
         </w:rPr>
         <w:t>response_time</w:t>
       </w:r>
       <w:proofErr w:type="spellEnd"/>
       <w:r>
         <w:rPr>
-          <w:rFonts w:asciiTheme="majorHAnsi" w:hAnsiTheme="majorHAnsi" w:cstheme="majorHAnsi"/>
-          <w:sz w:val="24"/>
-          <w:szCs w:val="24"/>
+          <w:rFonts w:cs="Calibri"/>
         </w:rPr>
         <w:t>}}</w:t>
       </w:r>
@@ -433,43 +359,33 @@
     <w:p>
       <w:pPr>
         <w:rPr>
-          <w:rFonts w:asciiTheme="majorHAnsi" w:hAnsiTheme="majorHAnsi" w:cstheme="majorHAnsi"/>
-          <w:sz w:val="24"/>
-          <w:szCs w:val="24"/>
+          <w:rFonts w:cs="Calibri"/>
         </w:rPr>
       </w:pPr>
       <w:r>
         <w:rPr>
-          <w:rFonts w:asciiTheme="majorHAnsi" w:hAnsiTheme="majorHAnsi" w:cstheme="majorHAnsi"/>
+          <w:rFonts w:cs="Calibri"/>
           <w:b/>
-          <w:sz w:val="24"/>
-          <w:szCs w:val="24"/>
         </w:rPr>
         <w:t xml:space="preserve">Office Address: </w:t>
       </w:r>
       <w:r>
         <w:rPr>
-          <w:rFonts w:asciiTheme="majorHAnsi" w:hAnsiTheme="majorHAnsi" w:cstheme="majorHAnsi"/>
-          <w:sz w:val="24"/>
-          <w:szCs w:val="24"/>
+          <w:rFonts w:cs="Calibri"/>
         </w:rPr>
         <w:t>{{</w:t>
       </w:r>
       <w:proofErr w:type="spellStart"/>
       <w:r>
         <w:rPr>
-          <w:rFonts w:asciiTheme="majorHAnsi" w:hAnsiTheme="majorHAnsi" w:cstheme="majorHAnsi"/>
-          <w:sz w:val="24"/>
-          <w:szCs w:val="24"/>
+          <w:rFonts w:cs="Calibri"/>
         </w:rPr>
         <w:t>office_address</w:t>
       </w:r>
       <w:proofErr w:type="spellEnd"/>
       <w:r>
         <w:rPr>
-          <w:rFonts w:asciiTheme="majorHAnsi" w:hAnsiTheme="majorHAnsi" w:cstheme="majorHAnsi"/>
-          <w:sz w:val="24"/>
-          <w:szCs w:val="24"/>
+          <w:rFonts w:cs="Calibri"/>
         </w:rPr>
         <w:t>}}</w:t>
       </w:r>
@@ -477,43 +393,33 @@
     <w:p>
       <w:pPr>
         <w:rPr>
-          <w:rFonts w:asciiTheme="majorHAnsi" w:hAnsiTheme="majorHAnsi" w:cstheme="majorHAnsi"/>
-          <w:sz w:val="24"/>
-          <w:szCs w:val="24"/>
+          <w:rFonts w:cs="Calibri"/>
         </w:rPr>
       </w:pPr>
       <w:r>
         <w:rPr>
-          <w:rFonts w:asciiTheme="majorHAnsi" w:hAnsiTheme="majorHAnsi" w:cstheme="majorHAnsi"/>
+          <w:rFonts w:cs="Calibri"/>
           <w:b/>
-          <w:sz w:val="24"/>
-          <w:szCs w:val="24"/>
         </w:rPr>
         <w:t xml:space="preserve">Office Phone: </w:t>
       </w:r>
       <w:r>
         <w:rPr>
-          <w:rFonts w:asciiTheme="majorHAnsi" w:hAnsiTheme="majorHAnsi" w:cstheme="majorHAnsi"/>
-          <w:sz w:val="24"/>
-          <w:szCs w:val="24"/>
+          <w:rFonts w:cs="Calibri"/>
         </w:rPr>
         <w:t>{{</w:t>
       </w:r>
       <w:proofErr w:type="spellStart"/>
       <w:r>
         <w:rPr>
-          <w:rFonts w:asciiTheme="majorHAnsi" w:hAnsiTheme="majorHAnsi" w:cstheme="majorHAnsi"/>
-          <w:sz w:val="24"/>
-          <w:szCs w:val="24"/>
+          <w:rFonts w:cs="Calibri"/>
         </w:rPr>
         <w:t>office_phone</w:t>
       </w:r>
       <w:proofErr w:type="spellEnd"/>
       <w:r>
         <w:rPr>
-          <w:rFonts w:asciiTheme="majorHAnsi" w:hAnsiTheme="majorHAnsi" w:cstheme="majorHAnsi"/>
-          <w:sz w:val="24"/>
-          <w:szCs w:val="24"/>
+          <w:rFonts w:cs="Calibri"/>
         </w:rPr>
         <w:t>}}</w:t>
       </w:r>
@@ -528,36 +434,35 @@
       </w:pPr>
       <w:r>
         <w:rPr>
-          <w:rFonts w:asciiTheme="majorHAnsi" w:hAnsiTheme="majorHAnsi" w:cstheme="majorHAnsi"/>
+          <w:rFonts w:cs="Calibri"/>
           <w:b/>
-          <w:sz w:val="24"/>
-          <w:szCs w:val="24"/>
         </w:rPr>
         <w:t xml:space="preserve">Office Hours: </w:t>
       </w:r>
       <w:r>
         <w:rPr>
-          <w:rFonts w:asciiTheme="majorHAnsi" w:hAnsiTheme="majorHAnsi" w:cstheme="majorHAnsi"/>
-          <w:sz w:val="24"/>
-          <w:szCs w:val="24"/>
+          <w:rFonts w:cs="Calibri"/>
         </w:rPr>
         <w:t>{{</w:t>
       </w:r>
       <w:proofErr w:type="spellStart"/>
       <w:r>
         <w:rPr>
-          <w:rFonts w:asciiTheme="majorHAnsi" w:hAnsiTheme="majorHAnsi" w:cstheme="majorHAnsi"/>
-          <w:sz w:val="24"/>
-          <w:szCs w:val="24"/>
-        </w:rPr>
-        <w:t>office_hours</w:t>
+          <w:rFonts w:cs="Calibri"/>
+        </w:rPr>
+        <w:t>office_</w:t>
+      </w:r>
+      <w:r>
+        <w:rPr>
+          <w:rFonts w:cs="Calibri"/>
+          <w:b/>
+        </w:rPr>
+        <w:t>hours</w:t>
       </w:r>
       <w:proofErr w:type="spellEnd"/>
       <w:r>
         <w:rPr>
-          <w:rFonts w:asciiTheme="majorHAnsi" w:hAnsiTheme="majorHAnsi" w:cstheme="majorHAnsi"/>
-          <w:sz w:val="24"/>
-          <w:szCs w:val="24"/>
+          <w:rFonts w:cs="Calibri"/>
         </w:rPr>
         <w:t>}}</w:t>
       </w:r>
@@ -583,25 +488,19 @@
     <w:p>
       <w:pPr>
         <w:rPr>
-          <w:rFonts w:asciiTheme="majorHAnsi" w:hAnsiTheme="majorHAnsi" w:cstheme="majorHAnsi"/>
-          <w:sz w:val="24"/>
-          <w:szCs w:val="24"/>
+          <w:rFonts w:cs="Calibri"/>
         </w:rPr>
       </w:pPr>
       <w:r>
         <w:rPr>
-          <w:rFonts w:asciiTheme="majorHAnsi" w:hAnsiTheme="majorHAnsi" w:cstheme="majorHAnsi"/>
+          <w:rFonts w:cs="Calibri"/>
           <w:b/>
-          <w:sz w:val="24"/>
-          <w:szCs w:val="24"/>
         </w:rPr>
         <w:t xml:space="preserve">Course Modality: </w:t>
       </w:r>
       <w:r>
         <w:rPr>
-          <w:rFonts w:asciiTheme="majorHAnsi" w:hAnsiTheme="majorHAnsi" w:cstheme="majorHAnsi"/>
-          <w:sz w:val="24"/>
-          <w:szCs w:val="24"/>
+          <w:rFonts w:cs="Calibri"/>
         </w:rPr>
         <w:t>{{modality}}</w:t>
       </w:r>
@@ -609,43 +508,33 @@
     <w:p>
       <w:pPr>
         <w:rPr>
-          <w:rFonts w:asciiTheme="majorHAnsi" w:hAnsiTheme="majorHAnsi" w:cstheme="majorHAnsi"/>
-          <w:sz w:val="24"/>
-          <w:szCs w:val="24"/>
+          <w:rFonts w:cs="Calibri"/>
         </w:rPr>
       </w:pPr>
       <w:r>
         <w:rPr>
-          <w:rFonts w:asciiTheme="majorHAnsi" w:hAnsiTheme="majorHAnsi" w:cstheme="majorHAnsi"/>
+          <w:rFonts w:cs="Calibri"/>
           <w:b/>
-          <w:sz w:val="24"/>
-          <w:szCs w:val="24"/>
         </w:rPr>
         <w:t xml:space="preserve">Class Location: </w:t>
       </w:r>
       <w:r>
         <w:rPr>
-          <w:rFonts w:asciiTheme="majorHAnsi" w:hAnsiTheme="majorHAnsi" w:cstheme="majorHAnsi"/>
-          <w:sz w:val="24"/>
-          <w:szCs w:val="24"/>
+          <w:rFonts w:cs="Calibri"/>
         </w:rPr>
         <w:t>{{</w:t>
       </w:r>
       <w:proofErr w:type="spellStart"/>
       <w:r>
         <w:rPr>
-          <w:rFonts w:asciiTheme="majorHAnsi" w:hAnsiTheme="majorHAnsi" w:cstheme="majorHAnsi"/>
-          <w:sz w:val="24"/>
-          <w:szCs w:val="24"/>
+          <w:rFonts w:cs="Calibri"/>
         </w:rPr>
         <w:t>class_location</w:t>
       </w:r>
       <w:proofErr w:type="spellEnd"/>
       <w:r>
         <w:rPr>
-          <w:rFonts w:asciiTheme="majorHAnsi" w:hAnsiTheme="majorHAnsi" w:cstheme="majorHAnsi"/>
-          <w:sz w:val="24"/>
-          <w:szCs w:val="24"/>
+          <w:rFonts w:cs="Calibri"/>
         </w:rPr>
         <w:t>}}</w:t>
       </w:r>
@@ -671,43 +560,33 @@
     <w:p>
       <w:pPr>
         <w:rPr>
-          <w:rFonts w:asciiTheme="majorHAnsi" w:hAnsiTheme="majorHAnsi" w:cstheme="majorHAnsi"/>
-          <w:sz w:val="24"/>
-          <w:szCs w:val="24"/>
+          <w:rFonts w:cs="Calibri"/>
         </w:rPr>
       </w:pPr>
       <w:r>
         <w:rPr>
-          <w:rFonts w:asciiTheme="majorHAnsi" w:hAnsiTheme="majorHAnsi" w:cstheme="majorHAnsi"/>
+          <w:rFonts w:cs="Calibri"/>
           <w:b/>
-          <w:sz w:val="24"/>
-          <w:szCs w:val="24"/>
         </w:rPr>
         <w:t xml:space="preserve">Assignment Types / Title: </w:t>
       </w:r>
       <w:r>
         <w:rPr>
-          <w:rFonts w:asciiTheme="majorHAnsi" w:hAnsiTheme="majorHAnsi" w:cstheme="majorHAnsi"/>
-          <w:sz w:val="24"/>
-          <w:szCs w:val="24"/>
+          <w:rFonts w:cs="Calibri"/>
         </w:rPr>
         <w:t>{{</w:t>
       </w:r>
       <w:proofErr w:type="spellStart"/>
       <w:r>
         <w:rPr>
-          <w:rFonts w:asciiTheme="majorHAnsi" w:hAnsiTheme="majorHAnsi" w:cstheme="majorHAnsi"/>
-          <w:sz w:val="24"/>
-          <w:szCs w:val="24"/>
+          <w:rFonts w:cs="Calibri"/>
         </w:rPr>
         <w:t>assignment_types_title</w:t>
       </w:r>
       <w:proofErr w:type="spellEnd"/>
       <w:r>
         <w:rPr>
-          <w:rFonts w:asciiTheme="majorHAnsi" w:hAnsiTheme="majorHAnsi" w:cstheme="majorHAnsi"/>
-          <w:sz w:val="24"/>
-          <w:szCs w:val="24"/>
+          <w:rFonts w:cs="Calibri"/>
         </w:rPr>
         <w:t>}}</w:t>
       </w:r>
@@ -715,44 +594,33 @@
     <w:p>
       <w:pPr>
         <w:rPr>
-          <w:rFonts w:asciiTheme="majorHAnsi" w:hAnsiTheme="majorHAnsi" w:cstheme="majorHAnsi"/>
-          <w:sz w:val="24"/>
-          <w:szCs w:val="24"/>
+          <w:rFonts w:cs="Calibri"/>
         </w:rPr>
       </w:pPr>
       <w:r>
         <w:rPr>
-          <w:rFonts w:asciiTheme="majorHAnsi" w:hAnsiTheme="majorHAnsi" w:cstheme="majorHAnsi"/>
+          <w:rFonts w:cs="Calibri"/>
           <w:b/>
-          <w:sz w:val="24"/>
-          <w:szCs w:val="24"/>
-        </w:rPr>
-        <w:lastRenderedPageBreak/>
+        </w:rPr>
         <w:t xml:space="preserve">Assignment Delivery Platform: </w:t>
       </w:r>
       <w:r>
         <w:rPr>
-          <w:rFonts w:asciiTheme="majorHAnsi" w:hAnsiTheme="majorHAnsi" w:cstheme="majorHAnsi"/>
-          <w:sz w:val="24"/>
-          <w:szCs w:val="24"/>
+          <w:rFonts w:cs="Calibri"/>
         </w:rPr>
         <w:t>{{</w:t>
       </w:r>
       <w:proofErr w:type="spellStart"/>
       <w:r>
         <w:rPr>
-          <w:rFonts w:asciiTheme="majorHAnsi" w:hAnsiTheme="majorHAnsi" w:cstheme="majorHAnsi"/>
-          <w:sz w:val="24"/>
-          <w:szCs w:val="24"/>
+          <w:rFonts w:cs="Calibri"/>
         </w:rPr>
         <w:t>assignment_delivery</w:t>
       </w:r>
       <w:proofErr w:type="spellEnd"/>
       <w:r>
         <w:rPr>
-          <w:rFonts w:asciiTheme="majorHAnsi" w:hAnsiTheme="majorHAnsi" w:cstheme="majorHAnsi"/>
-          <w:sz w:val="24"/>
-          <w:szCs w:val="24"/>
+          <w:rFonts w:cs="Calibri"/>
         </w:rPr>
         <w:t>}}</w:t>
       </w:r>
@@ -760,43 +628,33 @@
     <w:p>
       <w:pPr>
         <w:rPr>
-          <w:rFonts w:asciiTheme="majorHAnsi" w:hAnsiTheme="majorHAnsi" w:cstheme="majorHAnsi"/>
-          <w:sz w:val="24"/>
-          <w:szCs w:val="24"/>
+          <w:rFonts w:cs="Calibri"/>
         </w:rPr>
       </w:pPr>
       <w:r>
         <w:rPr>
-          <w:rFonts w:asciiTheme="majorHAnsi" w:hAnsiTheme="majorHAnsi" w:cstheme="majorHAnsi"/>
+          <w:rFonts w:cs="Calibri"/>
           <w:b/>
-          <w:sz w:val="24"/>
-          <w:szCs w:val="24"/>
         </w:rPr>
         <w:t xml:space="preserve">Late or Missing Work Policy: </w:t>
       </w:r>
       <w:r>
         <w:rPr>
-          <w:rFonts w:asciiTheme="majorHAnsi" w:hAnsiTheme="majorHAnsi" w:cstheme="majorHAnsi"/>
-          <w:sz w:val="24"/>
-          <w:szCs w:val="24"/>
+          <w:rFonts w:cs="Calibri"/>
         </w:rPr>
         <w:t>{{</w:t>
       </w:r>
       <w:proofErr w:type="spellStart"/>
       <w:r>
         <w:rPr>
-          <w:rFonts w:asciiTheme="majorHAnsi" w:hAnsiTheme="majorHAnsi" w:cstheme="majorHAnsi"/>
-          <w:sz w:val="24"/>
-          <w:szCs w:val="24"/>
+          <w:rFonts w:cs="Calibri"/>
         </w:rPr>
         <w:t>deadline_expectations_title</w:t>
       </w:r>
       <w:proofErr w:type="spellEnd"/>
       <w:r>
         <w:rPr>
-          <w:rFonts w:asciiTheme="majorHAnsi" w:hAnsiTheme="majorHAnsi" w:cstheme="majorHAnsi"/>
-          <w:sz w:val="24"/>
-          <w:szCs w:val="24"/>
+          <w:rFonts w:cs="Calibri"/>
         </w:rPr>
         <w:t>}}</w:t>
       </w:r>
@@ -816,31 +674,26 @@
           <w:sz w:val="24"/>
           <w:szCs w:val="24"/>
         </w:rPr>
+        <w:lastRenderedPageBreak/>
         <w:t>5. STUDENT EXPECTATIONS</w:t>
       </w:r>
     </w:p>
     <w:p>
       <w:pPr>
         <w:rPr>
-          <w:rFonts w:asciiTheme="majorHAnsi" w:hAnsiTheme="majorHAnsi" w:cstheme="majorHAnsi"/>
-          <w:sz w:val="24"/>
-          <w:szCs w:val="24"/>
+          <w:rFonts w:cs="Calibri"/>
         </w:rPr>
       </w:pPr>
       <w:r>
         <w:rPr>
-          <w:rFonts w:asciiTheme="majorHAnsi" w:hAnsiTheme="majorHAnsi" w:cstheme="majorHAnsi"/>
+          <w:rFonts w:cs="Calibri"/>
           <w:b/>
-          <w:sz w:val="24"/>
-          <w:szCs w:val="24"/>
         </w:rPr>
         <w:t xml:space="preserve">Student Learning Outcomes (SLOs): </w:t>
       </w:r>
       <w:r>
         <w:rPr>
-          <w:rFonts w:asciiTheme="majorHAnsi" w:hAnsiTheme="majorHAnsi" w:cstheme="majorHAnsi"/>
-          <w:sz w:val="24"/>
-          <w:szCs w:val="24"/>
+          <w:rFonts w:cs="Calibri"/>
         </w:rPr>
         <w:t>{{SLOs}}</w:t>
       </w:r>
@@ -848,43 +701,33 @@
     <w:p>
       <w:pPr>
         <w:rPr>
-          <w:rFonts w:asciiTheme="majorHAnsi" w:hAnsiTheme="majorHAnsi" w:cstheme="majorHAnsi"/>
-          <w:sz w:val="24"/>
-          <w:szCs w:val="24"/>
+          <w:rFonts w:cs="Calibri"/>
         </w:rPr>
       </w:pPr>
       <w:r>
         <w:rPr>
-          <w:rFonts w:asciiTheme="majorHAnsi" w:hAnsiTheme="majorHAnsi" w:cstheme="majorHAnsi"/>
+          <w:rFonts w:cs="Calibri"/>
           <w:b/>
-          <w:sz w:val="24"/>
-          <w:szCs w:val="24"/>
         </w:rPr>
         <w:t xml:space="preserve">Credit Hour Statement: </w:t>
       </w:r>
       <w:r>
         <w:rPr>
-          <w:rFonts w:asciiTheme="majorHAnsi" w:hAnsiTheme="majorHAnsi" w:cstheme="majorHAnsi"/>
-          <w:sz w:val="24"/>
-          <w:szCs w:val="24"/>
+          <w:rFonts w:cs="Calibri"/>
         </w:rPr>
         <w:t>{{</w:t>
       </w:r>
       <w:proofErr w:type="spellStart"/>
       <w:r>
         <w:rPr>
-          <w:rFonts w:asciiTheme="majorHAnsi" w:hAnsiTheme="majorHAnsi" w:cstheme="majorHAnsi"/>
-          <w:sz w:val="24"/>
-          <w:szCs w:val="24"/>
+          <w:rFonts w:cs="Calibri"/>
         </w:rPr>
         <w:t>credit_hour</w:t>
       </w:r>
       <w:proofErr w:type="spellEnd"/>
       <w:r>
         <w:rPr>
-          <w:rFonts w:asciiTheme="majorHAnsi" w:hAnsiTheme="majorHAnsi" w:cstheme="majorHAnsi"/>
-          <w:sz w:val="24"/>
-          <w:szCs w:val="24"/>
+          <w:rFonts w:cs="Calibri"/>
         </w:rPr>
         <w:t>}}</w:t>
       </w:r>
@@ -892,25 +735,19 @@
     <w:p>
       <w:pPr>
         <w:rPr>
-          <w:rFonts w:asciiTheme="majorHAnsi" w:hAnsiTheme="majorHAnsi" w:cstheme="majorHAnsi"/>
-          <w:sz w:val="24"/>
-          <w:szCs w:val="24"/>
+          <w:rFonts w:cs="Calibri"/>
         </w:rPr>
       </w:pPr>
       <w:r>
         <w:rPr>
-          <w:rFonts w:asciiTheme="majorHAnsi" w:hAnsiTheme="majorHAnsi" w:cstheme="majorHAnsi"/>
+          <w:rFonts w:cs="Calibri"/>
           <w:b/>
-          <w:sz w:val="24"/>
-          <w:szCs w:val="24"/>
         </w:rPr>
         <w:t xml:space="preserve">Workload Expectation: </w:t>
       </w:r>
       <w:r>
         <w:rPr>
-          <w:rFonts w:asciiTheme="majorHAnsi" w:hAnsiTheme="majorHAnsi" w:cstheme="majorHAnsi"/>
-          <w:sz w:val="24"/>
-          <w:szCs w:val="24"/>
+          <w:rFonts w:cs="Calibri"/>
         </w:rPr>
         <w:t>{{workload}}</w:t>
       </w:r>
@@ -936,43 +773,33 @@
     <w:p>
       <w:pPr>
         <w:rPr>
-          <w:rFonts w:asciiTheme="majorHAnsi" w:hAnsiTheme="majorHAnsi" w:cstheme="majorHAnsi"/>
-          <w:sz w:val="24"/>
-          <w:szCs w:val="24"/>
+          <w:rFonts w:cs="Calibri"/>
         </w:rPr>
       </w:pPr>
       <w:r>
         <w:rPr>
-          <w:rFonts w:asciiTheme="majorHAnsi" w:hAnsiTheme="majorHAnsi" w:cstheme="majorHAnsi"/>
+          <w:rFonts w:cs="Calibri"/>
           <w:b/>
-          <w:sz w:val="24"/>
-          <w:szCs w:val="24"/>
         </w:rPr>
         <w:t xml:space="preserve">Final Grade Scale: </w:t>
       </w:r>
       <w:r>
         <w:rPr>
-          <w:rFonts w:asciiTheme="majorHAnsi" w:hAnsiTheme="majorHAnsi" w:cstheme="majorHAnsi"/>
-          <w:sz w:val="24"/>
-          <w:szCs w:val="24"/>
+          <w:rFonts w:cs="Calibri"/>
         </w:rPr>
         <w:t>{{</w:t>
       </w:r>
       <w:proofErr w:type="spellStart"/>
       <w:r>
         <w:rPr>
-          <w:rFonts w:asciiTheme="majorHAnsi" w:hAnsiTheme="majorHAnsi" w:cstheme="majorHAnsi"/>
-          <w:sz w:val="24"/>
-          <w:szCs w:val="24"/>
+          <w:rFonts w:cs="Calibri"/>
         </w:rPr>
         <w:t>final_grade_scale</w:t>
       </w:r>
       <w:proofErr w:type="spellEnd"/>
       <w:r>
         <w:rPr>
-          <w:rFonts w:asciiTheme="majorHAnsi" w:hAnsiTheme="majorHAnsi" w:cstheme="majorHAnsi"/>
-          <w:sz w:val="24"/>
-          <w:szCs w:val="24"/>
+          <w:rFonts w:cs="Calibri"/>
         </w:rPr>
         <w:t>}}</w:t>
       </w:r>
@@ -980,43 +807,33 @@
     <w:p>
       <w:pPr>
         <w:rPr>
-          <w:rFonts w:asciiTheme="majorHAnsi" w:hAnsiTheme="majorHAnsi" w:cstheme="majorHAnsi"/>
-          <w:sz w:val="24"/>
-          <w:szCs w:val="24"/>
+          <w:rFonts w:cs="Calibri"/>
         </w:rPr>
       </w:pPr>
       <w:r>
         <w:rPr>
-          <w:rFonts w:asciiTheme="majorHAnsi" w:hAnsiTheme="majorHAnsi" w:cstheme="majorHAnsi"/>
+          <w:rFonts w:cs="Calibri"/>
           <w:b/>
-          <w:sz w:val="24"/>
-          <w:szCs w:val="24"/>
         </w:rPr>
         <w:t xml:space="preserve">Grading Process Breakdown: </w:t>
       </w:r>
       <w:r>
         <w:rPr>
-          <w:rFonts w:asciiTheme="majorHAnsi" w:hAnsiTheme="majorHAnsi" w:cstheme="majorHAnsi"/>
-          <w:sz w:val="24"/>
-          <w:szCs w:val="24"/>
+          <w:rFonts w:cs="Calibri"/>
         </w:rPr>
         <w:t>{{</w:t>
       </w:r>
       <w:proofErr w:type="spellStart"/>
       <w:r>
         <w:rPr>
-          <w:rFonts w:asciiTheme="majorHAnsi" w:hAnsiTheme="majorHAnsi" w:cstheme="majorHAnsi"/>
-          <w:sz w:val="24"/>
-          <w:szCs w:val="24"/>
+          <w:rFonts w:cs="Calibri"/>
         </w:rPr>
         <w:t>grading_process</w:t>
       </w:r>
       <w:proofErr w:type="spellEnd"/>
       <w:r>
         <w:rPr>
-          <w:rFonts w:asciiTheme="majorHAnsi" w:hAnsiTheme="majorHAnsi" w:cstheme="majorHAnsi"/>
-          <w:sz w:val="24"/>
-          <w:szCs w:val="24"/>
+          <w:rFonts w:cs="Calibri"/>
         </w:rPr>
         <w:t>}}</w:t>
       </w:r>
@@ -1042,16 +859,12 @@
     <w:p>
       <w:pPr>
         <w:rPr>
-          <w:rFonts w:asciiTheme="majorHAnsi" w:hAnsiTheme="majorHAnsi" w:cstheme="majorHAnsi"/>
-          <w:sz w:val="24"/>
-          <w:szCs w:val="24"/>
+          <w:rFonts w:cs="Calibri"/>
         </w:rPr>
       </w:pPr>
       <w:r>
         <w:rPr>
-          <w:rFonts w:asciiTheme="majorHAnsi" w:hAnsiTheme="majorHAnsi" w:cstheme="majorHAnsi"/>
-          <w:sz w:val="24"/>
-          <w:szCs w:val="24"/>
+          <w:rFonts w:cs="Calibri"/>
         </w:rPr>
         <w:t>In the preparation and presentation of any assigned work, including examinations, tests, quizzes, term papers, reports, and other written or oral exercises, every student shall conform to a strict standard of academic honesty. Any attempt to deceive a faculty member or to help another student do so will be considered a violation of this standard.</w:t>
       </w:r>
@@ -1059,16 +872,12 @@
     <w:p>
       <w:pPr>
         <w:rPr>
-          <w:rFonts w:asciiTheme="majorHAnsi" w:hAnsiTheme="majorHAnsi" w:cstheme="majorHAnsi"/>
-          <w:sz w:val="24"/>
-          <w:szCs w:val="24"/>
+          <w:rFonts w:cs="Calibri"/>
         </w:rPr>
       </w:pPr>
       <w:r>
         <w:rPr>
-          <w:rFonts w:asciiTheme="majorHAnsi" w:hAnsiTheme="majorHAnsi" w:cstheme="majorHAnsi"/>
-          <w:sz w:val="24"/>
-          <w:szCs w:val="24"/>
+          <w:rFonts w:cs="Calibri"/>
         </w:rPr>
         <w:t>In all assignments, students must acknowledge the words and/or ideas of others taken from print or electronic media, whether a direct quotation or a paraphrase. Any omission of this is dishonest. Cheating on examinations or tests consists of knowingly giving, receiving, or using, or attempting to give, receive, or use, unauthorized assistance during an examination or test.</w:t>
       </w:r>
@@ -1076,16 +885,12 @@
     <w:p>
       <w:pPr>
         <w:rPr>
-          <w:rFonts w:asciiTheme="majorHAnsi" w:hAnsiTheme="majorHAnsi" w:cstheme="majorHAnsi"/>
-          <w:sz w:val="24"/>
-          <w:szCs w:val="24"/>
+          <w:rFonts w:cs="Calibri"/>
         </w:rPr>
       </w:pPr>
       <w:r>
         <w:rPr>
-          <w:rFonts w:asciiTheme="majorHAnsi" w:hAnsiTheme="majorHAnsi" w:cstheme="majorHAnsi"/>
-          <w:sz w:val="24"/>
-          <w:szCs w:val="24"/>
+          <w:rFonts w:cs="Calibri"/>
         </w:rPr>
         <w:t>A faculty member may record a grade of zero for any assignment on which a student has plagiarized or cheated. For repeat offenses within a single course, the faculty member may record a grade of F for the course. Violations of this policy in multiple courses may result in dismissal from the college. See University Academic Honesty Policy and Tutorial on Plagiarism.</w:t>
       </w:r>
@@ -1111,27 +916,14 @@
     <w:p>
       <w:pPr>
         <w:rPr>
-          <w:rFonts w:asciiTheme="majorHAnsi" w:hAnsiTheme="majorHAnsi" w:cstheme="majorHAnsi"/>
-          <w:sz w:val="24"/>
-          <w:szCs w:val="24"/>
+          <w:rFonts w:cs="Calibri"/>
         </w:rPr>
       </w:pPr>
       <w:r>
         <w:rPr>
-          <w:rFonts w:asciiTheme="majorHAnsi" w:hAnsiTheme="majorHAnsi" w:cstheme="majorHAnsi"/>
-          <w:sz w:val="24"/>
-          <w:szCs w:val="24"/>
-        </w:rPr>
-        <w:t xml:space="preserve">According to the Americans with Disabilities Act (as amended, 2008), each student with a disability has the right to request services from UNH to accommodate their disability. If you are a student with a documented disability or believe you may have a disability that requires accommodations, please contact Janessa Zurek, Student Accessibility Coordinator, in the Student Services Suite at 603.641.4383 or jenessa.zurek@unh.edu. Accommodation letters are </w:t>
-      </w:r>
-      <w:r>
-        <w:rPr>
-          <w:rFonts w:asciiTheme="majorHAnsi" w:hAnsiTheme="majorHAnsi" w:cstheme="majorHAnsi"/>
-          <w:sz w:val="24"/>
-          <w:szCs w:val="24"/>
-        </w:rPr>
-        <w:lastRenderedPageBreak/>
-        <w:t>created by our Coordinator with the student. Please follow up with your instructor as soon as possible to ensure timely implementation of identified accommodations.</w:t>
+          <w:rFonts w:cs="Calibri"/>
+        </w:rPr>
+        <w:t>According to the Americans with Disabilities Act (as amended, 2008), each student with a disability has the right to request services from UNH to accommodate their disability. If you are a student with a documented disability or believe you may have a disability that requires accommodations, please contact Janessa Zurek, Student Accessibility Coordinator, in the Student Services Suite at 603.641.4383 or jenessa.zurek@unh.edu. Accommodation letters are created by our Coordinator with the student. Please follow up with your instructor as soon as possible to ensure timely implementation of identified accommodations.</w:t>
       </w:r>
     </w:p>
     <w:p>
@@ -1155,16 +947,12 @@
     <w:p>
       <w:pPr>
         <w:rPr>
-          <w:rFonts w:asciiTheme="majorHAnsi" w:hAnsiTheme="majorHAnsi" w:cstheme="majorHAnsi"/>
-          <w:sz w:val="24"/>
-          <w:szCs w:val="24"/>
+          <w:rFonts w:cs="Calibri"/>
         </w:rPr>
       </w:pPr>
       <w:r>
         <w:rPr>
-          <w:rFonts w:asciiTheme="majorHAnsi" w:hAnsiTheme="majorHAnsi" w:cstheme="majorHAnsi"/>
-          <w:sz w:val="24"/>
-          <w:szCs w:val="24"/>
+          <w:rFonts w:cs="Calibri"/>
         </w:rPr>
         <w:t>In partnership with The Mental Health Center of Greater Manchester, UNH Manchester offers consultation visits in the Academic Advising department (located in the Student Services suites, 4th floor). Services include:</w:t>
       </w:r>
@@ -1173,17 +961,14 @@
       <w:pPr>
         <w:pStyle w:val="ListBullet"/>
         <w:rPr>
-          <w:rFonts w:asciiTheme="majorHAnsi" w:hAnsiTheme="majorHAnsi" w:cstheme="majorHAnsi"/>
-          <w:sz w:val="24"/>
-          <w:szCs w:val="24"/>
+          <w:rFonts w:cs="Calibri"/>
         </w:rPr>
       </w:pPr>
       <w:r>
         <w:rPr>
-          <w:rFonts w:asciiTheme="majorHAnsi" w:hAnsiTheme="majorHAnsi" w:cstheme="majorHAnsi"/>
-          <w:sz w:val="24"/>
-          <w:szCs w:val="24"/>
-        </w:rPr>
+          <w:rFonts w:cs="Calibri"/>
+        </w:rPr>
+        <w:lastRenderedPageBreak/>
         <w:t>Free confidential screening and consultation with a licensed mental health therapist.</w:t>
       </w:r>
     </w:p>
@@ -1191,16 +976,12 @@
       <w:pPr>
         <w:pStyle w:val="ListBullet"/>
         <w:rPr>
-          <w:rFonts w:asciiTheme="majorHAnsi" w:hAnsiTheme="majorHAnsi" w:cstheme="majorHAnsi"/>
-          <w:sz w:val="24"/>
-          <w:szCs w:val="24"/>
+          <w:rFonts w:cs="Calibri"/>
         </w:rPr>
       </w:pPr>
       <w:r>
         <w:rPr>
-          <w:rFonts w:asciiTheme="majorHAnsi" w:hAnsiTheme="majorHAnsi" w:cstheme="majorHAnsi"/>
-          <w:sz w:val="24"/>
-          <w:szCs w:val="24"/>
+          <w:rFonts w:cs="Calibri"/>
         </w:rPr>
         <w:t>Referrals to mental health or substance misuse treatment.</w:t>
       </w:r>
@@ -1209,16 +990,12 @@
       <w:pPr>
         <w:pStyle w:val="ListBullet"/>
         <w:rPr>
-          <w:rFonts w:asciiTheme="majorHAnsi" w:hAnsiTheme="majorHAnsi" w:cstheme="majorHAnsi"/>
-          <w:sz w:val="24"/>
-          <w:szCs w:val="24"/>
+          <w:rFonts w:cs="Calibri"/>
         </w:rPr>
       </w:pPr>
       <w:r>
         <w:rPr>
-          <w:rFonts w:asciiTheme="majorHAnsi" w:hAnsiTheme="majorHAnsi" w:cstheme="majorHAnsi"/>
-          <w:sz w:val="24"/>
-          <w:szCs w:val="24"/>
+          <w:rFonts w:cs="Calibri"/>
         </w:rPr>
         <w:t>Assistance in understanding how to afford additional treatment, with or without insurance, or find free services.</w:t>
       </w:r>
@@ -1226,16 +1003,12 @@
     <w:p>
       <w:pPr>
         <w:rPr>
-          <w:rFonts w:asciiTheme="majorHAnsi" w:hAnsiTheme="majorHAnsi" w:cstheme="majorHAnsi"/>
-          <w:sz w:val="24"/>
-          <w:szCs w:val="24"/>
+          <w:rFonts w:cs="Calibri"/>
         </w:rPr>
       </w:pPr>
       <w:r>
         <w:rPr>
-          <w:rFonts w:asciiTheme="majorHAnsi" w:hAnsiTheme="majorHAnsi" w:cstheme="majorHAnsi"/>
-          <w:sz w:val="24"/>
-          <w:szCs w:val="24"/>
+          <w:rFonts w:cs="Calibri"/>
         </w:rPr>
         <w:t>If you would like to connect to counseling services directly, you may do so by contacting The Greater Manchester Mental Health Center at (603) 668-4111. If you or someone you know is experiencing a mental health or substance misuse crisis, please contact the Mobile Crisis Response Team (MCRT) at (800) 688-3544.</w:t>
       </w:r>
@@ -1243,16 +1016,12 @@
     <w:p>
       <w:pPr>
         <w:rPr>
-          <w:rFonts w:asciiTheme="majorHAnsi" w:hAnsiTheme="majorHAnsi" w:cstheme="majorHAnsi"/>
-          <w:sz w:val="24"/>
-          <w:szCs w:val="24"/>
+          <w:rFonts w:cs="Calibri"/>
         </w:rPr>
       </w:pPr>
       <w:r>
         <w:rPr>
-          <w:rFonts w:asciiTheme="majorHAnsi" w:hAnsiTheme="majorHAnsi" w:cstheme="majorHAnsi"/>
-          <w:sz w:val="24"/>
-          <w:szCs w:val="24"/>
+          <w:rFonts w:cs="Calibri"/>
         </w:rPr>
         <w:t>The National Suicide Prevention Lifeline provides 24/7, free, and confidential support via phone or chat for people in distress, resources for you or your loved ones, and best practices for professionals. Call (800) 273-TALK (8255).</w:t>
       </w:r>
@@ -1278,16 +1047,12 @@
     <w:p>
       <w:pPr>
         <w:rPr>
-          <w:rFonts w:asciiTheme="majorHAnsi" w:hAnsiTheme="majorHAnsi" w:cstheme="majorHAnsi"/>
-          <w:sz w:val="24"/>
-          <w:szCs w:val="24"/>
+          <w:rFonts w:cs="Calibri"/>
         </w:rPr>
       </w:pPr>
       <w:r>
         <w:rPr>
-          <w:rFonts w:asciiTheme="majorHAnsi" w:hAnsiTheme="majorHAnsi" w:cstheme="majorHAnsi"/>
-          <w:sz w:val="24"/>
-          <w:szCs w:val="24"/>
+          <w:rFonts w:cs="Calibri"/>
         </w:rPr>
         <w:t>The University of New Hampshire at Manchester and its community are committed to assuring a safe and productive educational environment for all students. Title IX makes it clear that violence, harassment, and discrimination based on sex and gender are civil rights offenses subject to the same kinds of accountability and support applied to offenses against other protected categories such as race, national origin, and ability.</w:t>
       </w:r>
@@ -1295,16 +1060,12 @@
     <w:p>
       <w:pPr>
         <w:rPr>
-          <w:rFonts w:asciiTheme="majorHAnsi" w:hAnsiTheme="majorHAnsi" w:cstheme="majorHAnsi"/>
-          <w:sz w:val="24"/>
-          <w:szCs w:val="24"/>
+          <w:rFonts w:cs="Calibri"/>
         </w:rPr>
       </w:pPr>
       <w:r>
         <w:rPr>
-          <w:rFonts w:asciiTheme="majorHAnsi" w:hAnsiTheme="majorHAnsi" w:cstheme="majorHAnsi"/>
-          <w:sz w:val="24"/>
-          <w:szCs w:val="24"/>
+          <w:rFonts w:cs="Calibri"/>
         </w:rPr>
         <w:t>If you or someone you know has experienced sexual or relationship violence, and/or stalking and harassment, you can find the appropriate resources below.</w:t>
       </w:r>
@@ -1331,16 +1092,12 @@
       <w:pPr>
         <w:pStyle w:val="ListBullet"/>
         <w:rPr>
-          <w:rFonts w:asciiTheme="majorHAnsi" w:hAnsiTheme="majorHAnsi" w:cstheme="majorHAnsi"/>
-          <w:sz w:val="24"/>
-          <w:szCs w:val="24"/>
+          <w:rFonts w:cs="Calibri"/>
         </w:rPr>
       </w:pPr>
       <w:r>
         <w:rPr>
-          <w:rFonts w:asciiTheme="majorHAnsi" w:hAnsiTheme="majorHAnsi" w:cstheme="majorHAnsi"/>
-          <w:sz w:val="24"/>
-          <w:szCs w:val="24"/>
+          <w:rFonts w:cs="Calibri"/>
         </w:rPr>
         <w:t>Title IX Deputy Intake Coordinator: Lisa Enright, 603-641-4336. Office location: fourth floor, Room 439.</w:t>
       </w:r>
@@ -1349,16 +1106,12 @@
       <w:pPr>
         <w:pStyle w:val="ListBullet"/>
         <w:rPr>
-          <w:rFonts w:asciiTheme="majorHAnsi" w:hAnsiTheme="majorHAnsi" w:cstheme="majorHAnsi"/>
-          <w:sz w:val="24"/>
-          <w:szCs w:val="24"/>
+          <w:rFonts w:cs="Calibri"/>
         </w:rPr>
       </w:pPr>
       <w:r>
         <w:rPr>
-          <w:rFonts w:asciiTheme="majorHAnsi" w:hAnsiTheme="majorHAnsi" w:cstheme="majorHAnsi"/>
-          <w:sz w:val="24"/>
-          <w:szCs w:val="24"/>
+          <w:rFonts w:cs="Calibri"/>
         </w:rPr>
         <w:t>UNH Manchester Security: 603-641-4124, or located in the second-floor foyer.</w:t>
       </w:r>
@@ -1378,7 +1131,6 @@
           <w:sz w:val="24"/>
           <w:szCs w:val="24"/>
         </w:rPr>
-        <w:lastRenderedPageBreak/>
         <w:t>Reporting Off Campus:</w:t>
       </w:r>
     </w:p>
@@ -1386,16 +1138,12 @@
       <w:pPr>
         <w:pStyle w:val="ListBullet"/>
         <w:rPr>
-          <w:rFonts w:asciiTheme="majorHAnsi" w:hAnsiTheme="majorHAnsi" w:cstheme="majorHAnsi"/>
-          <w:sz w:val="24"/>
-          <w:szCs w:val="24"/>
+          <w:rFonts w:cs="Calibri"/>
         </w:rPr>
       </w:pPr>
       <w:r>
         <w:rPr>
-          <w:rFonts w:asciiTheme="majorHAnsi" w:hAnsiTheme="majorHAnsi" w:cstheme="majorHAnsi"/>
-          <w:sz w:val="24"/>
-          <w:szCs w:val="24"/>
+          <w:rFonts w:cs="Calibri"/>
         </w:rPr>
         <w:t>Manchester Police Department: 603-668-8711, 405 Valley St, Manchester, NH, or your local police department.</w:t>
       </w:r>
@@ -1403,16 +1151,12 @@
     <w:p>
       <w:pPr>
         <w:rPr>
-          <w:rFonts w:asciiTheme="majorHAnsi" w:hAnsiTheme="majorHAnsi" w:cstheme="majorHAnsi"/>
-          <w:sz w:val="24"/>
-          <w:szCs w:val="24"/>
+          <w:rFonts w:cs="Calibri"/>
         </w:rPr>
       </w:pPr>
       <w:r>
         <w:rPr>
-          <w:rFonts w:asciiTheme="majorHAnsi" w:hAnsiTheme="majorHAnsi" w:cstheme="majorHAnsi"/>
-          <w:sz w:val="24"/>
-          <w:szCs w:val="24"/>
+          <w:rFonts w:cs="Calibri"/>
         </w:rPr>
         <w:t>For emergencies, dial 911.</w:t>
       </w:r>

</xml_diff>

<commit_message>
Reduce line spacing and UNH logo size
</commit_message>
<xml_diff>
--- a/updated_syllabus_detector_common_template.docx
+++ b/updated_syllabus_detector_common_template.docx
@@ -23,22 +23,22 @@
           <w:szCs w:val="28"/>
         </w:rPr>
         <w:drawing>
-          <wp:anchor distT="0" distB="0" distL="114300" distR="114300" simplePos="0" relativeHeight="251659264" behindDoc="0" locked="0" layoutInCell="1" allowOverlap="1" wp14:anchorId="352D9101" wp14:editId="3020A4BD">
+          <wp:anchor distT="0" distB="0" distL="114300" distR="114300" simplePos="0" relativeHeight="251659264" behindDoc="0" locked="0" layoutInCell="1" allowOverlap="1" wp14:anchorId="352D9101" wp14:editId="4F1123B6">
             <wp:simplePos x="0" y="0"/>
             <wp:positionH relativeFrom="margin">
-              <wp:posOffset>0</wp:posOffset>
+              <wp:posOffset>4130040</wp:posOffset>
             </wp:positionH>
             <wp:positionV relativeFrom="page">
-              <wp:posOffset>1099820</wp:posOffset>
+              <wp:posOffset>260350</wp:posOffset>
             </wp:positionV>
-            <wp:extent cx="5943600" cy="1047750"/>
-            <wp:effectExtent l="0" t="0" r="0" b="0"/>
+            <wp:extent cx="2378075" cy="419100"/>
+            <wp:effectExtent l="0" t="0" r="3175" b="0"/>
             <wp:wrapThrough wrapText="bothSides">
               <wp:wrapPolygon edited="0">
                 <wp:start x="0" y="0"/>
-                <wp:lineTo x="0" y="21207"/>
-                <wp:lineTo x="21531" y="21207"/>
-                <wp:lineTo x="21531" y="0"/>
+                <wp:lineTo x="0" y="20618"/>
+                <wp:lineTo x="21456" y="20618"/>
+                <wp:lineTo x="21456" y="0"/>
                 <wp:lineTo x="0" y="0"/>
               </wp:wrapPolygon>
             </wp:wrapThrough>
@@ -56,7 +56,7 @@
                     </pic:cNvPicPr>
                   </pic:nvPicPr>
                   <pic:blipFill>
-                    <a:blip r:embed="rId6">
+                    <a:blip r:embed="rId8">
                       <a:extLst>
                         <a:ext uri="{28A0092B-C50C-407E-A947-70E740481C1C}">
                           <a14:useLocalDpi xmlns:a14="http://schemas.microsoft.com/office/drawing/2010/main" val="0"/>
@@ -71,7 +71,7 @@
                   <pic:spPr bwMode="auto">
                     <a:xfrm>
                       <a:off x="0" y="0"/>
-                      <a:ext cx="5943600" cy="1047750"/>
+                      <a:ext cx="2378075" cy="419100"/>
                     </a:xfrm>
                     <a:prstGeom prst="rect">
                       <a:avLst/>
@@ -81,6 +81,12 @@
                 </pic:pic>
               </a:graphicData>
             </a:graphic>
+            <wp14:sizeRelH relativeFrom="margin">
+              <wp14:pctWidth>0</wp14:pctWidth>
+            </wp14:sizeRelH>
+            <wp14:sizeRelV relativeFrom="margin">
+              <wp14:pctHeight>0</wp14:pctHeight>
+            </wp14:sizeRelV>
           </wp:anchor>
         </w:drawing>
       </w:r>
@@ -150,190 +156,196 @@
     </w:p>
     <w:p>
       <w:pPr>
-        <w:rPr>
-          <w:rFonts w:cs="Calibri"/>
+        <w:pStyle w:val="NoSpacing"/>
+        <w:rPr>
+          <w:rFonts w:asciiTheme="majorHAnsi" w:hAnsiTheme="majorHAnsi" w:cstheme="majorHAnsi"/>
         </w:rPr>
       </w:pPr>
       <w:r>
         <w:rPr>
-          <w:rFonts w:cs="Calibri"/>
+          <w:rFonts w:asciiTheme="majorHAnsi" w:hAnsiTheme="majorHAnsi" w:cstheme="majorHAnsi"/>
           <w:b/>
         </w:rPr>
         <w:t xml:space="preserve">Instructor Name: </w:t>
       </w:r>
       <w:r>
         <w:rPr>
-          <w:rFonts w:cs="Calibri"/>
+          <w:rFonts w:asciiTheme="majorHAnsi" w:hAnsiTheme="majorHAnsi" w:cstheme="majorHAnsi"/>
         </w:rPr>
         <w:t>{{</w:t>
       </w:r>
       <w:proofErr w:type="spellStart"/>
       <w:r>
         <w:rPr>
-          <w:rFonts w:cs="Calibri"/>
+          <w:rFonts w:asciiTheme="majorHAnsi" w:hAnsiTheme="majorHAnsi" w:cstheme="majorHAnsi"/>
         </w:rPr>
         <w:t>instructor_name</w:t>
       </w:r>
       <w:proofErr w:type="spellEnd"/>
       <w:r>
         <w:rPr>
-          <w:rFonts w:cs="Calibri"/>
+          <w:rFonts w:asciiTheme="majorHAnsi" w:hAnsiTheme="majorHAnsi" w:cstheme="majorHAnsi"/>
         </w:rPr>
         <w:t>}}</w:t>
       </w:r>
     </w:p>
     <w:p>
       <w:pPr>
-        <w:rPr>
-          <w:rFonts w:cs="Calibri"/>
+        <w:pStyle w:val="NoSpacing"/>
+        <w:rPr>
+          <w:rFonts w:asciiTheme="majorHAnsi" w:hAnsiTheme="majorHAnsi" w:cstheme="majorHAnsi"/>
         </w:rPr>
       </w:pPr>
       <w:r>
         <w:rPr>
-          <w:rFonts w:cs="Calibri"/>
+          <w:rFonts w:asciiTheme="majorHAnsi" w:hAnsiTheme="majorHAnsi" w:cstheme="majorHAnsi"/>
           <w:b/>
         </w:rPr>
         <w:t xml:space="preserve">Instructor Title: </w:t>
       </w:r>
       <w:r>
         <w:rPr>
-          <w:rFonts w:cs="Calibri"/>
+          <w:rFonts w:asciiTheme="majorHAnsi" w:hAnsiTheme="majorHAnsi" w:cstheme="majorHAnsi"/>
         </w:rPr>
         <w:t>{{</w:t>
       </w:r>
       <w:proofErr w:type="spellStart"/>
       <w:r>
         <w:rPr>
-          <w:rFonts w:cs="Calibri"/>
+          <w:rFonts w:asciiTheme="majorHAnsi" w:hAnsiTheme="majorHAnsi" w:cstheme="majorHAnsi"/>
         </w:rPr>
         <w:t>instructor_title</w:t>
       </w:r>
       <w:proofErr w:type="spellEnd"/>
       <w:r>
         <w:rPr>
-          <w:rFonts w:cs="Calibri"/>
+          <w:rFonts w:asciiTheme="majorHAnsi" w:hAnsiTheme="majorHAnsi" w:cstheme="majorHAnsi"/>
         </w:rPr>
         <w:t>}}</w:t>
       </w:r>
     </w:p>
     <w:p>
       <w:pPr>
-        <w:rPr>
-          <w:rFonts w:cs="Calibri"/>
+        <w:pStyle w:val="NoSpacing"/>
+        <w:rPr>
+          <w:rFonts w:asciiTheme="majorHAnsi" w:hAnsiTheme="majorHAnsi" w:cstheme="majorHAnsi"/>
         </w:rPr>
       </w:pPr>
       <w:r>
         <w:rPr>
-          <w:rFonts w:cs="Calibri"/>
+          <w:rFonts w:asciiTheme="majorHAnsi" w:hAnsiTheme="majorHAnsi" w:cstheme="majorHAnsi"/>
           <w:b/>
         </w:rPr>
         <w:t xml:space="preserve">Instructor Department: </w:t>
       </w:r>
       <w:r>
         <w:rPr>
-          <w:rFonts w:cs="Calibri"/>
+          <w:rFonts w:asciiTheme="majorHAnsi" w:hAnsiTheme="majorHAnsi" w:cstheme="majorHAnsi"/>
         </w:rPr>
         <w:t>{{</w:t>
       </w:r>
       <w:proofErr w:type="spellStart"/>
       <w:r>
         <w:rPr>
-          <w:rFonts w:cs="Calibri"/>
+          <w:rFonts w:asciiTheme="majorHAnsi" w:hAnsiTheme="majorHAnsi" w:cstheme="majorHAnsi"/>
         </w:rPr>
         <w:t>instructor_department</w:t>
       </w:r>
       <w:proofErr w:type="spellEnd"/>
       <w:r>
         <w:rPr>
-          <w:rFonts w:cs="Calibri"/>
+          <w:rFonts w:asciiTheme="majorHAnsi" w:hAnsiTheme="majorHAnsi" w:cstheme="majorHAnsi"/>
         </w:rPr>
         <w:t>}}</w:t>
       </w:r>
     </w:p>
     <w:p>
       <w:pPr>
-        <w:rPr>
-          <w:rFonts w:cs="Calibri"/>
+        <w:pStyle w:val="NoSpacing"/>
+        <w:rPr>
+          <w:rFonts w:asciiTheme="majorHAnsi" w:hAnsiTheme="majorHAnsi" w:cstheme="majorHAnsi"/>
         </w:rPr>
       </w:pPr>
       <w:r>
         <w:rPr>
-          <w:rFonts w:cs="Calibri"/>
+          <w:rFonts w:asciiTheme="majorHAnsi" w:hAnsiTheme="majorHAnsi" w:cstheme="majorHAnsi"/>
           <w:b/>
         </w:rPr>
         <w:t xml:space="preserve">Instructor Email: </w:t>
       </w:r>
       <w:r>
         <w:rPr>
-          <w:rFonts w:cs="Calibri"/>
+          <w:rFonts w:asciiTheme="majorHAnsi" w:hAnsiTheme="majorHAnsi" w:cstheme="majorHAnsi"/>
         </w:rPr>
         <w:t>{{email}}</w:t>
       </w:r>
     </w:p>
     <w:p>
       <w:pPr>
-        <w:rPr>
-          <w:rFonts w:cs="Calibri"/>
+        <w:pStyle w:val="NoSpacing"/>
+        <w:rPr>
+          <w:rFonts w:asciiTheme="majorHAnsi" w:hAnsiTheme="majorHAnsi" w:cstheme="majorHAnsi"/>
         </w:rPr>
       </w:pPr>
       <w:r>
         <w:rPr>
-          <w:rFonts w:cs="Calibri"/>
+          <w:rFonts w:asciiTheme="majorHAnsi" w:hAnsiTheme="majorHAnsi" w:cstheme="majorHAnsi"/>
           <w:b/>
         </w:rPr>
         <w:t xml:space="preserve">Preferred Contact Method: </w:t>
       </w:r>
       <w:r>
         <w:rPr>
-          <w:rFonts w:cs="Calibri"/>
+          <w:rFonts w:asciiTheme="majorHAnsi" w:hAnsiTheme="majorHAnsi" w:cstheme="majorHAnsi"/>
         </w:rPr>
         <w:t>{{</w:t>
       </w:r>
       <w:proofErr w:type="spellStart"/>
       <w:r>
         <w:rPr>
-          <w:rFonts w:cs="Calibri"/>
+          <w:rFonts w:asciiTheme="majorHAnsi" w:hAnsiTheme="majorHAnsi" w:cstheme="majorHAnsi"/>
         </w:rPr>
         <w:t>preferred_contact_method</w:t>
       </w:r>
       <w:proofErr w:type="spellEnd"/>
       <w:r>
         <w:rPr>
-          <w:rFonts w:cs="Calibri"/>
+          <w:rFonts w:asciiTheme="majorHAnsi" w:hAnsiTheme="majorHAnsi" w:cstheme="majorHAnsi"/>
         </w:rPr>
         <w:t>}}</w:t>
       </w:r>
     </w:p>
     <w:p>
       <w:pPr>
-        <w:rPr>
-          <w:rFonts w:cs="Calibri"/>
+        <w:pStyle w:val="NoSpacing"/>
+        <w:rPr>
+          <w:rFonts w:asciiTheme="majorHAnsi" w:hAnsiTheme="majorHAnsi" w:cstheme="majorHAnsi"/>
         </w:rPr>
       </w:pPr>
       <w:r>
         <w:rPr>
-          <w:rFonts w:cs="Calibri"/>
+          <w:rFonts w:asciiTheme="majorHAnsi" w:hAnsiTheme="majorHAnsi" w:cstheme="majorHAnsi"/>
           <w:b/>
         </w:rPr>
         <w:t xml:space="preserve">Response Time Expectation: </w:t>
       </w:r>
       <w:r>
         <w:rPr>
-          <w:rFonts w:cs="Calibri"/>
+          <w:rFonts w:asciiTheme="majorHAnsi" w:hAnsiTheme="majorHAnsi" w:cstheme="majorHAnsi"/>
         </w:rPr>
         <w:t>{{</w:t>
       </w:r>
       <w:proofErr w:type="spellStart"/>
       <w:r>
         <w:rPr>
-          <w:rFonts w:cs="Calibri"/>
+          <w:rFonts w:asciiTheme="majorHAnsi" w:hAnsiTheme="majorHAnsi" w:cstheme="majorHAnsi"/>
         </w:rPr>
         <w:t>response_time</w:t>
       </w:r>
       <w:proofErr w:type="spellEnd"/>
       <w:r>
         <w:rPr>
-          <w:rFonts w:cs="Calibri"/>
+          <w:rFonts w:asciiTheme="majorHAnsi" w:hAnsiTheme="majorHAnsi" w:cstheme="majorHAnsi"/>
         </w:rPr>
         <w:t>}}</w:t>
       </w:r>
@@ -358,111 +370,117 @@
     </w:p>
     <w:p>
       <w:pPr>
-        <w:rPr>
-          <w:rFonts w:cs="Calibri"/>
+        <w:pStyle w:val="NoSpacing"/>
+        <w:rPr>
+          <w:rFonts w:asciiTheme="majorHAnsi" w:hAnsiTheme="majorHAnsi" w:cstheme="majorHAnsi"/>
+          <w:bCs/>
         </w:rPr>
       </w:pPr>
       <w:r>
         <w:rPr>
-          <w:rFonts w:cs="Calibri"/>
+          <w:rFonts w:asciiTheme="majorHAnsi" w:hAnsiTheme="majorHAnsi" w:cstheme="majorHAnsi"/>
           <w:b/>
         </w:rPr>
         <w:t xml:space="preserve">Office Address: </w:t>
       </w:r>
       <w:r>
         <w:rPr>
-          <w:rFonts w:cs="Calibri"/>
+          <w:rFonts w:asciiTheme="majorHAnsi" w:hAnsiTheme="majorHAnsi" w:cstheme="majorHAnsi"/>
+          <w:bCs/>
         </w:rPr>
         <w:t>{{</w:t>
       </w:r>
       <w:proofErr w:type="spellStart"/>
       <w:r>
         <w:rPr>
-          <w:rFonts w:cs="Calibri"/>
+          <w:rFonts w:asciiTheme="majorHAnsi" w:hAnsiTheme="majorHAnsi" w:cstheme="majorHAnsi"/>
+          <w:bCs/>
         </w:rPr>
         <w:t>office_address</w:t>
       </w:r>
       <w:proofErr w:type="spellEnd"/>
       <w:r>
         <w:rPr>
-          <w:rFonts w:cs="Calibri"/>
+          <w:rFonts w:asciiTheme="majorHAnsi" w:hAnsiTheme="majorHAnsi" w:cstheme="majorHAnsi"/>
+          <w:bCs/>
         </w:rPr>
         <w:t>}}</w:t>
       </w:r>
     </w:p>
     <w:p>
       <w:pPr>
-        <w:rPr>
-          <w:rFonts w:cs="Calibri"/>
+        <w:pStyle w:val="NoSpacing"/>
+        <w:rPr>
+          <w:rFonts w:asciiTheme="majorHAnsi" w:hAnsiTheme="majorHAnsi" w:cstheme="majorHAnsi"/>
+          <w:b/>
         </w:rPr>
       </w:pPr>
       <w:r>
         <w:rPr>
-          <w:rFonts w:cs="Calibri"/>
+          <w:rFonts w:asciiTheme="majorHAnsi" w:hAnsiTheme="majorHAnsi" w:cstheme="majorHAnsi"/>
           <w:b/>
         </w:rPr>
         <w:t xml:space="preserve">Office Phone: </w:t>
       </w:r>
       <w:r>
         <w:rPr>
-          <w:rFonts w:cs="Calibri"/>
+          <w:rFonts w:asciiTheme="majorHAnsi" w:hAnsiTheme="majorHAnsi" w:cstheme="majorHAnsi"/>
+          <w:bCs/>
         </w:rPr>
         <w:t>{{</w:t>
       </w:r>
       <w:proofErr w:type="spellStart"/>
       <w:r>
         <w:rPr>
-          <w:rFonts w:cs="Calibri"/>
+          <w:rFonts w:asciiTheme="majorHAnsi" w:hAnsiTheme="majorHAnsi" w:cstheme="majorHAnsi"/>
+          <w:bCs/>
         </w:rPr>
         <w:t>office_phone</w:t>
       </w:r>
       <w:proofErr w:type="spellEnd"/>
       <w:r>
         <w:rPr>
-          <w:rFonts w:cs="Calibri"/>
+          <w:rFonts w:asciiTheme="majorHAnsi" w:hAnsiTheme="majorHAnsi" w:cstheme="majorHAnsi"/>
+          <w:bCs/>
         </w:rPr>
         <w:t>}}</w:t>
       </w:r>
     </w:p>
     <w:p>
       <w:pPr>
+        <w:pStyle w:val="NoSpacing"/>
         <w:rPr>
           <w:rFonts w:asciiTheme="majorHAnsi" w:hAnsiTheme="majorHAnsi" w:cstheme="majorHAnsi"/>
-          <w:sz w:val="24"/>
-          <w:szCs w:val="24"/>
+          <w:b/>
         </w:rPr>
       </w:pPr>
       <w:r>
         <w:rPr>
-          <w:rFonts w:cs="Calibri"/>
+          <w:rFonts w:asciiTheme="majorHAnsi" w:hAnsiTheme="majorHAnsi" w:cstheme="majorHAnsi"/>
           <w:b/>
         </w:rPr>
         <w:t xml:space="preserve">Office Hours: </w:t>
       </w:r>
       <w:r>
         <w:rPr>
-          <w:rFonts w:cs="Calibri"/>
+          <w:rFonts w:asciiTheme="majorHAnsi" w:hAnsiTheme="majorHAnsi" w:cstheme="majorHAnsi"/>
+          <w:bCs/>
         </w:rPr>
         <w:t>{{</w:t>
       </w:r>
       <w:proofErr w:type="spellStart"/>
       <w:r>
         <w:rPr>
-          <w:rFonts w:cs="Calibri"/>
-        </w:rPr>
-        <w:t>office_</w:t>
-      </w:r>
-      <w:r>
-        <w:rPr>
-          <w:rFonts w:cs="Calibri"/>
-          <w:b/>
-        </w:rPr>
-        <w:t>hours</w:t>
+          <w:rFonts w:asciiTheme="majorHAnsi" w:hAnsiTheme="majorHAnsi" w:cstheme="majorHAnsi"/>
+          <w:bCs/>
+        </w:rPr>
+        <w:t>office_hours</w:t>
       </w:r>
       <w:proofErr w:type="spellEnd"/>
       <w:r>
         <w:rPr>
-          <w:rFonts w:cs="Calibri"/>
+          <w:rFonts w:asciiTheme="majorHAnsi" w:hAnsiTheme="majorHAnsi" w:cstheme="majorHAnsi"/>
+          <w:bCs/>
         </w:rPr>
         <w:t>}}</w:t>
       </w:r>
@@ -487,54 +505,62 @@
     </w:p>
     <w:p>
       <w:pPr>
-        <w:rPr>
-          <w:rFonts w:cs="Calibri"/>
+        <w:pStyle w:val="NoSpacing"/>
+        <w:rPr>
+          <w:rFonts w:asciiTheme="majorHAnsi" w:hAnsiTheme="majorHAnsi" w:cstheme="majorHAnsi"/>
+          <w:b/>
         </w:rPr>
       </w:pPr>
       <w:r>
         <w:rPr>
-          <w:rFonts w:cs="Calibri"/>
+          <w:rFonts w:asciiTheme="majorHAnsi" w:hAnsiTheme="majorHAnsi" w:cstheme="majorHAnsi"/>
           <w:b/>
         </w:rPr>
         <w:t xml:space="preserve">Course Modality: </w:t>
       </w:r>
       <w:r>
         <w:rPr>
-          <w:rFonts w:cs="Calibri"/>
+          <w:rFonts w:asciiTheme="majorHAnsi" w:hAnsiTheme="majorHAnsi" w:cstheme="majorHAnsi"/>
+          <w:bCs/>
         </w:rPr>
         <w:t>{{modality}}</w:t>
       </w:r>
     </w:p>
     <w:p>
       <w:pPr>
-        <w:rPr>
-          <w:rFonts w:cs="Calibri"/>
+        <w:pStyle w:val="NoSpacing"/>
+        <w:rPr>
+          <w:rFonts w:asciiTheme="majorHAnsi" w:hAnsiTheme="majorHAnsi" w:cstheme="majorHAnsi"/>
+          <w:b/>
         </w:rPr>
       </w:pPr>
       <w:r>
         <w:rPr>
-          <w:rFonts w:cs="Calibri"/>
+          <w:rFonts w:asciiTheme="majorHAnsi" w:hAnsiTheme="majorHAnsi" w:cstheme="majorHAnsi"/>
           <w:b/>
         </w:rPr>
         <w:t xml:space="preserve">Class Location: </w:t>
       </w:r>
       <w:r>
         <w:rPr>
-          <w:rFonts w:cs="Calibri"/>
+          <w:rFonts w:asciiTheme="majorHAnsi" w:hAnsiTheme="majorHAnsi" w:cstheme="majorHAnsi"/>
+          <w:bCs/>
         </w:rPr>
         <w:t>{{</w:t>
       </w:r>
       <w:proofErr w:type="spellStart"/>
       <w:r>
         <w:rPr>
-          <w:rFonts w:cs="Calibri"/>
+          <w:rFonts w:asciiTheme="majorHAnsi" w:hAnsiTheme="majorHAnsi" w:cstheme="majorHAnsi"/>
+          <w:bCs/>
         </w:rPr>
         <w:t>class_location</w:t>
       </w:r>
       <w:proofErr w:type="spellEnd"/>
       <w:r>
         <w:rPr>
-          <w:rFonts w:cs="Calibri"/>
+          <w:rFonts w:asciiTheme="majorHAnsi" w:hAnsiTheme="majorHAnsi" w:cstheme="majorHAnsi"/>
+          <w:bCs/>
         </w:rPr>
         <w:t>}}</w:t>
       </w:r>
@@ -559,102 +585,117 @@
     </w:p>
     <w:p>
       <w:pPr>
-        <w:rPr>
-          <w:rFonts w:cs="Calibri"/>
+        <w:pStyle w:val="NoSpacing"/>
+        <w:rPr>
+          <w:rFonts w:asciiTheme="majorHAnsi" w:hAnsiTheme="majorHAnsi" w:cstheme="majorHAnsi"/>
+          <w:b/>
         </w:rPr>
       </w:pPr>
       <w:r>
         <w:rPr>
-          <w:rFonts w:cs="Calibri"/>
+          <w:rFonts w:asciiTheme="majorHAnsi" w:hAnsiTheme="majorHAnsi" w:cstheme="majorHAnsi"/>
           <w:b/>
         </w:rPr>
         <w:t xml:space="preserve">Assignment Types / Title: </w:t>
       </w:r>
       <w:r>
         <w:rPr>
-          <w:rFonts w:cs="Calibri"/>
+          <w:rFonts w:asciiTheme="majorHAnsi" w:hAnsiTheme="majorHAnsi" w:cstheme="majorHAnsi"/>
+          <w:bCs/>
         </w:rPr>
         <w:t>{{</w:t>
       </w:r>
       <w:proofErr w:type="spellStart"/>
       <w:r>
         <w:rPr>
-          <w:rFonts w:cs="Calibri"/>
+          <w:rFonts w:asciiTheme="majorHAnsi" w:hAnsiTheme="majorHAnsi" w:cstheme="majorHAnsi"/>
+          <w:bCs/>
         </w:rPr>
         <w:t>assignment_types_title</w:t>
       </w:r>
       <w:proofErr w:type="spellEnd"/>
       <w:r>
         <w:rPr>
-          <w:rFonts w:cs="Calibri"/>
+          <w:rFonts w:asciiTheme="majorHAnsi" w:hAnsiTheme="majorHAnsi" w:cstheme="majorHAnsi"/>
+          <w:bCs/>
         </w:rPr>
         <w:t>}}</w:t>
       </w:r>
     </w:p>
     <w:p>
       <w:pPr>
-        <w:rPr>
-          <w:rFonts w:cs="Calibri"/>
+        <w:pStyle w:val="NoSpacing"/>
+        <w:rPr>
+          <w:rFonts w:asciiTheme="majorHAnsi" w:hAnsiTheme="majorHAnsi" w:cstheme="majorHAnsi"/>
+          <w:b/>
         </w:rPr>
       </w:pPr>
       <w:r>
         <w:rPr>
-          <w:rFonts w:cs="Calibri"/>
+          <w:rFonts w:asciiTheme="majorHAnsi" w:hAnsiTheme="majorHAnsi" w:cstheme="majorHAnsi"/>
           <w:b/>
         </w:rPr>
         <w:t xml:space="preserve">Assignment Delivery Platform: </w:t>
       </w:r>
       <w:r>
         <w:rPr>
-          <w:rFonts w:cs="Calibri"/>
+          <w:rFonts w:asciiTheme="majorHAnsi" w:hAnsiTheme="majorHAnsi" w:cstheme="majorHAnsi"/>
+          <w:bCs/>
         </w:rPr>
         <w:t>{{</w:t>
       </w:r>
       <w:proofErr w:type="spellStart"/>
       <w:r>
         <w:rPr>
-          <w:rFonts w:cs="Calibri"/>
+          <w:rFonts w:asciiTheme="majorHAnsi" w:hAnsiTheme="majorHAnsi" w:cstheme="majorHAnsi"/>
+          <w:bCs/>
         </w:rPr>
         <w:t>assignment_delivery</w:t>
       </w:r>
       <w:proofErr w:type="spellEnd"/>
       <w:r>
         <w:rPr>
-          <w:rFonts w:cs="Calibri"/>
+          <w:rFonts w:asciiTheme="majorHAnsi" w:hAnsiTheme="majorHAnsi" w:cstheme="majorHAnsi"/>
+          <w:bCs/>
         </w:rPr>
         <w:t>}}</w:t>
       </w:r>
     </w:p>
     <w:p>
       <w:pPr>
-        <w:rPr>
-          <w:rFonts w:cs="Calibri"/>
+        <w:pStyle w:val="NoSpacing"/>
+        <w:rPr>
+          <w:rFonts w:asciiTheme="majorHAnsi" w:hAnsiTheme="majorHAnsi" w:cstheme="majorHAnsi"/>
+          <w:b/>
         </w:rPr>
       </w:pPr>
       <w:r>
         <w:rPr>
-          <w:rFonts w:cs="Calibri"/>
+          <w:rFonts w:asciiTheme="majorHAnsi" w:hAnsiTheme="majorHAnsi" w:cstheme="majorHAnsi"/>
           <w:b/>
         </w:rPr>
         <w:t xml:space="preserve">Late or Missing Work Policy: </w:t>
       </w:r>
       <w:r>
         <w:rPr>
-          <w:rFonts w:cs="Calibri"/>
+          <w:rFonts w:asciiTheme="majorHAnsi" w:hAnsiTheme="majorHAnsi" w:cstheme="majorHAnsi"/>
+          <w:bCs/>
         </w:rPr>
         <w:t>{{</w:t>
       </w:r>
       <w:proofErr w:type="spellStart"/>
       <w:r>
         <w:rPr>
-          <w:rFonts w:cs="Calibri"/>
+          <w:rFonts w:asciiTheme="majorHAnsi" w:hAnsiTheme="majorHAnsi" w:cstheme="majorHAnsi"/>
+          <w:bCs/>
         </w:rPr>
         <w:t>deadline_expectations_title</w:t>
       </w:r>
       <w:proofErr w:type="spellEnd"/>
       <w:r>
         <w:rPr>
-          <w:rFonts w:cs="Calibri"/>
+          <w:rFonts w:asciiTheme="majorHAnsi" w:hAnsiTheme="majorHAnsi" w:cstheme="majorHAnsi"/>
+          <w:bCs/>
         </w:rPr>
         <w:t>}}</w:t>
       </w:r>
@@ -674,80 +715,115 @@
           <w:sz w:val="24"/>
           <w:szCs w:val="24"/>
         </w:rPr>
-        <w:lastRenderedPageBreak/>
         <w:t>5. STUDENT EXPECTATIONS</w:t>
       </w:r>
     </w:p>
     <w:p>
       <w:pPr>
-        <w:rPr>
-          <w:rFonts w:cs="Calibri"/>
+        <w:pStyle w:val="NoSpacing"/>
+        <w:rPr>
+          <w:rFonts w:asciiTheme="majorHAnsi" w:hAnsiTheme="majorHAnsi" w:cstheme="majorHAnsi"/>
+          <w:b/>
         </w:rPr>
       </w:pPr>
       <w:r>
         <w:rPr>
-          <w:rFonts w:cs="Calibri"/>
+          <w:rFonts w:asciiTheme="majorHAnsi" w:hAnsiTheme="majorHAnsi" w:cstheme="majorHAnsi"/>
           <w:b/>
         </w:rPr>
-        <w:t xml:space="preserve">Student Learning Outcomes (SLOs): </w:t>
+        <w:t>Student Learning Outcomes (SLOs)</w:t>
       </w:r>
+    </w:p>
+    <w:p>
+      <w:pPr>
+        <w:pStyle w:val="NoSpacing"/>
+        <w:rPr>
+          <w:rFonts w:asciiTheme="majorHAnsi" w:hAnsiTheme="majorHAnsi" w:cstheme="majorHAnsi"/>
+          <w:bCs/>
+        </w:rPr>
+      </w:pPr>
       <w:r>
         <w:rPr>
-          <w:rFonts w:cs="Calibri"/>
+          <w:rFonts w:asciiTheme="majorHAnsi" w:hAnsiTheme="majorHAnsi" w:cstheme="majorHAnsi"/>
+          <w:bCs/>
         </w:rPr>
         <w:t>{{SLOs}}</w:t>
       </w:r>
     </w:p>
     <w:p>
       <w:pPr>
-        <w:rPr>
-          <w:rFonts w:cs="Calibri"/>
+        <w:pStyle w:val="NoSpacing"/>
+        <w:rPr>
+          <w:rFonts w:asciiTheme="majorHAnsi" w:hAnsiTheme="majorHAnsi" w:cstheme="majorHAnsi"/>
+          <w:bCs/>
+        </w:rPr>
+      </w:pPr>
+    </w:p>
+    <w:p>
+      <w:pPr>
+        <w:pStyle w:val="NoSpacing"/>
+        <w:rPr>
+          <w:rFonts w:asciiTheme="majorHAnsi" w:hAnsiTheme="majorHAnsi" w:cstheme="majorHAnsi"/>
+          <w:bCs/>
         </w:rPr>
       </w:pPr>
       <w:r>
         <w:rPr>
-          <w:rFonts w:cs="Calibri"/>
+          <w:rFonts w:asciiTheme="majorHAnsi" w:hAnsiTheme="majorHAnsi" w:cstheme="majorHAnsi"/>
           <w:b/>
         </w:rPr>
         <w:t xml:space="preserve">Credit Hour Statement: </w:t>
       </w:r>
       <w:r>
         <w:rPr>
-          <w:rFonts w:cs="Calibri"/>
+          <w:rFonts w:asciiTheme="majorHAnsi" w:hAnsiTheme="majorHAnsi" w:cstheme="majorHAnsi"/>
+          <w:bCs/>
         </w:rPr>
         <w:t>{{</w:t>
       </w:r>
       <w:proofErr w:type="spellStart"/>
       <w:r>
         <w:rPr>
-          <w:rFonts w:cs="Calibri"/>
+          <w:rFonts w:asciiTheme="majorHAnsi" w:hAnsiTheme="majorHAnsi" w:cstheme="majorHAnsi"/>
+          <w:bCs/>
         </w:rPr>
         <w:t>credit_hour</w:t>
       </w:r>
       <w:proofErr w:type="spellEnd"/>
       <w:r>
         <w:rPr>
-          <w:rFonts w:cs="Calibri"/>
+          <w:rFonts w:asciiTheme="majorHAnsi" w:hAnsiTheme="majorHAnsi" w:cstheme="majorHAnsi"/>
+          <w:bCs/>
         </w:rPr>
         <w:t>}}</w:t>
       </w:r>
     </w:p>
     <w:p>
       <w:pPr>
-        <w:rPr>
-          <w:rFonts w:cs="Calibri"/>
+        <w:pStyle w:val="NoSpacing"/>
+        <w:rPr>
+          <w:rFonts w:asciiTheme="majorHAnsi" w:hAnsiTheme="majorHAnsi" w:cstheme="majorHAnsi"/>
+          <w:b/>
         </w:rPr>
       </w:pPr>
       <w:r>
         <w:rPr>
-          <w:rFonts w:cs="Calibri"/>
+          <w:rFonts w:asciiTheme="majorHAnsi" w:hAnsiTheme="majorHAnsi" w:cstheme="majorHAnsi"/>
           <w:b/>
         </w:rPr>
-        <w:t xml:space="preserve">Workload Expectation: </w:t>
+        <w:t>Workload Expectation</w:t>
       </w:r>
       <w:r>
         <w:rPr>
-          <w:rFonts w:cs="Calibri"/>
+          <w:rFonts w:asciiTheme="majorHAnsi" w:hAnsiTheme="majorHAnsi" w:cstheme="majorHAnsi"/>
+          <w:b/>
+        </w:rPr>
+        <w:t xml:space="preserve">: </w:t>
+      </w:r>
+      <w:r>
+        <w:rPr>
+          <w:rFonts w:asciiTheme="majorHAnsi" w:hAnsiTheme="majorHAnsi" w:cstheme="majorHAnsi"/>
+          <w:bCs/>
         </w:rPr>
         <w:t>{{workload}}</w:t>
       </w:r>
@@ -772,68 +848,105 @@
     </w:p>
     <w:p>
       <w:pPr>
-        <w:rPr>
-          <w:rFonts w:cs="Calibri"/>
+        <w:pStyle w:val="NoSpacing"/>
+        <w:rPr>
+          <w:rFonts w:asciiTheme="majorHAnsi" w:hAnsiTheme="majorHAnsi" w:cstheme="majorHAnsi"/>
+          <w:b/>
         </w:rPr>
       </w:pPr>
       <w:r>
         <w:rPr>
-          <w:rFonts w:cs="Calibri"/>
+          <w:rFonts w:asciiTheme="majorHAnsi" w:hAnsiTheme="majorHAnsi" w:cstheme="majorHAnsi"/>
           <w:b/>
         </w:rPr>
-        <w:t xml:space="preserve">Final Grade Scale: </w:t>
+        <w:t>Final Grade Scale</w:t>
       </w:r>
+    </w:p>
+    <w:p>
+      <w:pPr>
+        <w:pStyle w:val="NoSpacing"/>
+        <w:rPr>
+          <w:rFonts w:asciiTheme="majorHAnsi" w:hAnsiTheme="majorHAnsi" w:cstheme="majorHAnsi"/>
+          <w:bCs/>
+        </w:rPr>
+      </w:pPr>
       <w:r>
         <w:rPr>
-          <w:rFonts w:cs="Calibri"/>
+          <w:rFonts w:asciiTheme="majorHAnsi" w:hAnsiTheme="majorHAnsi" w:cstheme="majorHAnsi"/>
+          <w:bCs/>
         </w:rPr>
         <w:t>{{</w:t>
       </w:r>
       <w:proofErr w:type="spellStart"/>
       <w:r>
         <w:rPr>
-          <w:rFonts w:cs="Calibri"/>
+          <w:rFonts w:asciiTheme="majorHAnsi" w:hAnsiTheme="majorHAnsi" w:cstheme="majorHAnsi"/>
+          <w:bCs/>
         </w:rPr>
         <w:t>final_grade_scale</w:t>
       </w:r>
       <w:proofErr w:type="spellEnd"/>
       <w:r>
         <w:rPr>
-          <w:rFonts w:cs="Calibri"/>
+          <w:rFonts w:asciiTheme="majorHAnsi" w:hAnsiTheme="majorHAnsi" w:cstheme="majorHAnsi"/>
+          <w:bCs/>
         </w:rPr>
         <w:t>}}</w:t>
       </w:r>
     </w:p>
     <w:p>
       <w:pPr>
-        <w:rPr>
-          <w:rFonts w:cs="Calibri"/>
+        <w:pStyle w:val="NoSpacing"/>
+        <w:rPr>
+          <w:rFonts w:asciiTheme="majorHAnsi" w:hAnsiTheme="majorHAnsi" w:cstheme="majorHAnsi"/>
+          <w:b/>
+        </w:rPr>
+      </w:pPr>
+    </w:p>
+    <w:p>
+      <w:pPr>
+        <w:pStyle w:val="NoSpacing"/>
+        <w:rPr>
+          <w:rFonts w:asciiTheme="majorHAnsi" w:hAnsiTheme="majorHAnsi" w:cstheme="majorHAnsi"/>
+          <w:b/>
         </w:rPr>
       </w:pPr>
       <w:r>
         <w:rPr>
-          <w:rFonts w:cs="Calibri"/>
+          <w:rFonts w:asciiTheme="majorHAnsi" w:hAnsiTheme="majorHAnsi" w:cstheme="majorHAnsi"/>
           <w:b/>
         </w:rPr>
-        <w:t xml:space="preserve">Grading Process Breakdown: </w:t>
+        <w:t>Grading Process Breakdown</w:t>
       </w:r>
+    </w:p>
+    <w:p>
+      <w:pPr>
+        <w:pStyle w:val="NoSpacing"/>
+        <w:rPr>
+          <w:rFonts w:asciiTheme="majorHAnsi" w:hAnsiTheme="majorHAnsi" w:cstheme="majorHAnsi"/>
+          <w:b/>
+        </w:rPr>
+      </w:pPr>
       <w:r>
         <w:rPr>
-          <w:rFonts w:cs="Calibri"/>
+          <w:rFonts w:asciiTheme="majorHAnsi" w:hAnsiTheme="majorHAnsi" w:cstheme="majorHAnsi"/>
+          <w:bCs/>
         </w:rPr>
         <w:t>{{</w:t>
       </w:r>
       <w:proofErr w:type="spellStart"/>
       <w:r>
         <w:rPr>
-          <w:rFonts w:cs="Calibri"/>
+          <w:rFonts w:asciiTheme="majorHAnsi" w:hAnsiTheme="majorHAnsi" w:cstheme="majorHAnsi"/>
+          <w:bCs/>
         </w:rPr>
         <w:t>grading_process</w:t>
       </w:r>
       <w:proofErr w:type="spellEnd"/>
       <w:r>
         <w:rPr>
-          <w:rFonts w:cs="Calibri"/>
+          <w:rFonts w:asciiTheme="majorHAnsi" w:hAnsiTheme="majorHAnsi" w:cstheme="majorHAnsi"/>
+          <w:bCs/>
         </w:rPr>
         <w:t>}}</w:t>
       </w:r>
@@ -853,44 +966,48 @@
           <w:sz w:val="24"/>
           <w:szCs w:val="24"/>
         </w:rPr>
+        <w:lastRenderedPageBreak/>
         <w:t>7. ACADEMIC HONESTY</w:t>
       </w:r>
     </w:p>
     <w:p>
       <w:pPr>
-        <w:rPr>
-          <w:rFonts w:cs="Calibri"/>
+        <w:pStyle w:val="NoSpacing"/>
+        <w:rPr>
+          <w:rFonts w:asciiTheme="majorHAnsi" w:hAnsiTheme="majorHAnsi" w:cstheme="majorHAnsi"/>
         </w:rPr>
       </w:pPr>
       <w:r>
         <w:rPr>
-          <w:rFonts w:cs="Calibri"/>
+          <w:rFonts w:asciiTheme="majorHAnsi" w:hAnsiTheme="majorHAnsi" w:cstheme="majorHAnsi"/>
         </w:rPr>
         <w:t>In the preparation and presentation of any assigned work, including examinations, tests, quizzes, term papers, reports, and other written or oral exercises, every student shall conform to a strict standard of academic honesty. Any attempt to deceive a faculty member or to help another student do so will be considered a violation of this standard.</w:t>
       </w:r>
     </w:p>
     <w:p>
       <w:pPr>
-        <w:rPr>
-          <w:rFonts w:cs="Calibri"/>
+        <w:pStyle w:val="NoSpacing"/>
+        <w:rPr>
+          <w:rFonts w:asciiTheme="majorHAnsi" w:hAnsiTheme="majorHAnsi" w:cstheme="majorHAnsi"/>
         </w:rPr>
       </w:pPr>
       <w:r>
         <w:rPr>
-          <w:rFonts w:cs="Calibri"/>
+          <w:rFonts w:asciiTheme="majorHAnsi" w:hAnsiTheme="majorHAnsi" w:cstheme="majorHAnsi"/>
         </w:rPr>
         <w:t>In all assignments, students must acknowledge the words and/or ideas of others taken from print or electronic media, whether a direct quotation or a paraphrase. Any omission of this is dishonest. Cheating on examinations or tests consists of knowingly giving, receiving, or using, or attempting to give, receive, or use, unauthorized assistance during an examination or test.</w:t>
       </w:r>
     </w:p>
     <w:p>
       <w:pPr>
-        <w:rPr>
-          <w:rFonts w:cs="Calibri"/>
+        <w:pStyle w:val="NoSpacing"/>
+        <w:rPr>
+          <w:rFonts w:asciiTheme="majorHAnsi" w:hAnsiTheme="majorHAnsi" w:cstheme="majorHAnsi"/>
         </w:rPr>
       </w:pPr>
       <w:r>
         <w:rPr>
-          <w:rFonts w:cs="Calibri"/>
+          <w:rFonts w:asciiTheme="majorHAnsi" w:hAnsiTheme="majorHAnsi" w:cstheme="majorHAnsi"/>
         </w:rPr>
         <w:t>A faculty member may record a grade of zero for any assignment on which a student has plagiarized or cheated. For repeat offenses within a single course, the faculty member may record a grade of F for the course. Violations of this policy in multiple courses may result in dismissal from the college. See University Academic Honesty Policy and Tutorial on Plagiarism.</w:t>
       </w:r>
@@ -915,13 +1032,14 @@
     </w:p>
     <w:p>
       <w:pPr>
-        <w:rPr>
-          <w:rFonts w:cs="Calibri"/>
+        <w:pStyle w:val="NoSpacing"/>
+        <w:rPr>
+          <w:rFonts w:asciiTheme="majorHAnsi" w:hAnsiTheme="majorHAnsi" w:cstheme="majorHAnsi"/>
         </w:rPr>
       </w:pPr>
       <w:r>
         <w:rPr>
-          <w:rFonts w:cs="Calibri"/>
+          <w:rFonts w:asciiTheme="majorHAnsi" w:hAnsiTheme="majorHAnsi" w:cstheme="majorHAnsi"/>
         </w:rPr>
         <w:t>According to the Americans with Disabilities Act (as amended, 2008), each student with a disability has the right to request services from UNH to accommodate their disability. If you are a student with a documented disability or believe you may have a disability that requires accommodations, please contact Janessa Zurek, Student Accessibility Coordinator, in the Student Services Suite at 603.641.4383 or jenessa.zurek@unh.edu. Accommodation letters are created by our Coordinator with the student. Please follow up with your instructor as soon as possible to ensure timely implementation of identified accommodations.</w:t>
       </w:r>
@@ -946,13 +1064,14 @@
     </w:p>
     <w:p>
       <w:pPr>
-        <w:rPr>
-          <w:rFonts w:cs="Calibri"/>
+        <w:pStyle w:val="NoSpacing"/>
+        <w:rPr>
+          <w:rFonts w:asciiTheme="majorHAnsi" w:hAnsiTheme="majorHAnsi" w:cstheme="majorHAnsi"/>
         </w:rPr>
       </w:pPr>
       <w:r>
         <w:rPr>
-          <w:rFonts w:cs="Calibri"/>
+          <w:rFonts w:asciiTheme="majorHAnsi" w:hAnsiTheme="majorHAnsi" w:cstheme="majorHAnsi"/>
         </w:rPr>
         <w:t>In partnership with The Mental Health Center of Greater Manchester, UNH Manchester offers consultation visits in the Academic Advising department (located in the Student Services suites, 4th floor). Services include:</w:t>
       </w:r>
@@ -968,7 +1087,6 @@
         <w:rPr>
           <w:rFonts w:cs="Calibri"/>
         </w:rPr>
-        <w:lastRenderedPageBreak/>
         <w:t>Free confidential screening and consultation with a licensed mental health therapist.</w:t>
       </w:r>
     </w:p>
@@ -1002,26 +1120,28 @@
     </w:p>
     <w:p>
       <w:pPr>
-        <w:rPr>
-          <w:rFonts w:cs="Calibri"/>
+        <w:pStyle w:val="NoSpacing"/>
+        <w:rPr>
+          <w:rFonts w:asciiTheme="majorHAnsi" w:hAnsiTheme="majorHAnsi" w:cstheme="majorHAnsi"/>
         </w:rPr>
       </w:pPr>
       <w:r>
         <w:rPr>
-          <w:rFonts w:cs="Calibri"/>
+          <w:rFonts w:asciiTheme="majorHAnsi" w:hAnsiTheme="majorHAnsi" w:cstheme="majorHAnsi"/>
         </w:rPr>
         <w:t>If you would like to connect to counseling services directly, you may do so by contacting The Greater Manchester Mental Health Center at (603) 668-4111. If you or someone you know is experiencing a mental health or substance misuse crisis, please contact the Mobile Crisis Response Team (MCRT) at (800) 688-3544.</w:t>
       </w:r>
     </w:p>
     <w:p>
       <w:pPr>
-        <w:rPr>
-          <w:rFonts w:cs="Calibri"/>
+        <w:pStyle w:val="NoSpacing"/>
+        <w:rPr>
+          <w:rFonts w:asciiTheme="majorHAnsi" w:hAnsiTheme="majorHAnsi" w:cstheme="majorHAnsi"/>
         </w:rPr>
       </w:pPr>
       <w:r>
         <w:rPr>
-          <w:rFonts w:cs="Calibri"/>
+          <w:rFonts w:asciiTheme="majorHAnsi" w:hAnsiTheme="majorHAnsi" w:cstheme="majorHAnsi"/>
         </w:rPr>
         <w:t>The National Suicide Prevention Lifeline provides 24/7, free, and confidential support via phone or chat for people in distress, resources for you or your loved ones, and best practices for professionals. Call (800) 273-TALK (8255).</w:t>
       </w:r>
@@ -1046,26 +1166,35 @@
     </w:p>
     <w:p>
       <w:pPr>
-        <w:rPr>
-          <w:rFonts w:cs="Calibri"/>
+        <w:pStyle w:val="NoSpacing"/>
+        <w:rPr>
+          <w:rFonts w:asciiTheme="majorHAnsi" w:hAnsiTheme="majorHAnsi" w:cstheme="majorHAnsi"/>
         </w:rPr>
       </w:pPr>
       <w:r>
         <w:rPr>
-          <w:rFonts w:cs="Calibri"/>
-        </w:rPr>
-        <w:t>The University of New Hampshire at Manchester and its community are committed to assuring a safe and productive educational environment for all students. Title IX makes it clear that violence, harassment, and discrimination based on sex and gender are civil rights offenses subject to the same kinds of accountability and support applied to offenses against other protected categories such as race, national origin, and ability.</w:t>
+          <w:rFonts w:asciiTheme="majorHAnsi" w:hAnsiTheme="majorHAnsi" w:cstheme="majorHAnsi"/>
+        </w:rPr>
+        <w:t xml:space="preserve">The University of New Hampshire at Manchester and its community are committed to assuring a safe and productive educational environment for all students. Title IX makes it clear that violence, </w:t>
+      </w:r>
+      <w:r>
+        <w:rPr>
+          <w:rFonts w:asciiTheme="majorHAnsi" w:hAnsiTheme="majorHAnsi" w:cstheme="majorHAnsi"/>
+        </w:rPr>
+        <w:lastRenderedPageBreak/>
+        <w:t>harassment, and discrimination based on sex and gender are civil rights offenses subject to the same kinds of accountability and support applied to offenses against other protected categories such as race, national origin, and ability.</w:t>
       </w:r>
     </w:p>
     <w:p>
       <w:pPr>
-        <w:rPr>
-          <w:rFonts w:cs="Calibri"/>
+        <w:pStyle w:val="NoSpacing"/>
+        <w:rPr>
+          <w:rFonts w:asciiTheme="majorHAnsi" w:hAnsiTheme="majorHAnsi" w:cstheme="majorHAnsi"/>
         </w:rPr>
       </w:pPr>
       <w:r>
         <w:rPr>
-          <w:rFonts w:cs="Calibri"/>
+          <w:rFonts w:asciiTheme="majorHAnsi" w:hAnsiTheme="majorHAnsi" w:cstheme="majorHAnsi"/>
         </w:rPr>
         <w:t>If you or someone you know has experienced sexual or relationship violence, and/or stalking and harassment, you can find the appropriate resources below.</w:t>
       </w:r>
@@ -1162,6 +1291,7 @@
       </w:r>
     </w:p>
     <w:sectPr>
+      <w:headerReference w:type="default" r:id="rId9"/>
       <w:pgSz w:w="12240" w:h="15840"/>
       <w:pgMar w:top="1440" w:right="1440" w:bottom="1440" w:left="1440" w:header="720" w:footer="720" w:gutter="0"/>
       <w:cols w:space="720"/>
@@ -1169,6 +1299,82 @@
     </w:sectPr>
   </w:body>
 </w:document>
+</file>
+
+<file path=word/endnotes.xml><?xml version="1.0" encoding="utf-8"?>
+<w:endnotes xmlns:wpc="http://schemas.microsoft.com/office/word/2010/wordprocessingCanvas" xmlns:cx="http://schemas.microsoft.com/office/drawing/2014/chartex" xmlns:cx1="http://schemas.microsoft.com/office/drawing/2015/9/8/chartex" xmlns:cx2="http://schemas.microsoft.com/office/drawing/2015/10/21/chartex" xmlns:cx3="http://schemas.microsoft.com/office/drawing/2016/5/9/chartex" xmlns:cx4="http://schemas.microsoft.com/office/drawing/2016/5/10/chartex" xmlns:cx5="http://schemas.microsoft.com/office/drawing/2016/5/11/chartex" xmlns:cx6="http://schemas.microsoft.com/office/drawing/2016/5/12/chartex" xmlns:cx7="http://schemas.microsoft.com/office/drawing/2016/5/13/chartex" xmlns:cx8="http://schemas.microsoft.com/office/drawing/2016/5/14/chartex" xmlns:mc="http://schemas.openxmlformats.org/markup-compatibility/2006" xmlns:aink="http://schemas.microsoft.com/office/drawing/2016/ink" xmlns:am3d="http://schemas.microsoft.com/office/drawing/2017/model3d" xmlns:o="urn:schemas-microsoft-com:office:office" xmlns:oel="http://schemas.microsoft.com/office/2019/extlst" xmlns:r="http://schemas.openxmlformats.org/officeDocument/2006/relationships" xmlns:m="http://schemas.openxmlformats.org/officeDocument/2006/math" xmlns:v="urn:schemas-microsoft-com:vml" xmlns:wp14="http://schemas.microsoft.com/office/word/2010/wordprocessingDrawing" xmlns:wp="http://schemas.openxmlformats.org/drawingml/2006/wordprocessingDrawing" xmlns:w10="urn:schemas-microsoft-com:office:word" xmlns:w="http://schemas.openxmlformats.org/wordprocessingml/2006/main" xmlns:w14="http://schemas.microsoft.com/office/word/2010/wordml" xmlns:w15="http://schemas.microsoft.com/office/word/2012/wordml" xmlns:w16cex="http://schemas.microsoft.com/office/word/2018/wordml/cex" xmlns:w16cid="http://schemas.microsoft.com/office/word/2016/wordml/cid" xmlns:w16="http://schemas.microsoft.com/office/word/2018/wordml" xmlns:w16du="http://schemas.microsoft.com/office/word/2023/wordml/word16du" xmlns:w16sdtdh="http://schemas.microsoft.com/office/word/2020/wordml/sdtdatahash" xmlns:w16sdtfl="http://schemas.microsoft.com/office/word/2024/wordml/sdtformatlock" xmlns:w16se="http://schemas.microsoft.com/office/word/2015/wordml/symex" xmlns:wpg="http://schemas.microsoft.com/office/word/2010/wordprocessingGroup" xmlns:wpi="http://schemas.microsoft.com/office/word/2010/wordprocessingInk" xmlns:wne="http://schemas.microsoft.com/office/word/2006/wordml" xmlns:wps="http://schemas.microsoft.com/office/word/2010/wordprocessingShape" mc:Ignorable="w14 w15 w16se w16cid w16 w16cex w16sdtdh w16sdtfl w16du wp14">
+  <w:endnote w:type="separator" w:id="-1">
+    <w:p>
+      <w:pPr>
+        <w:spacing w:after="0" w:line="240" w:lineRule="auto"/>
+      </w:pPr>
+      <w:r>
+        <w:separator/>
+      </w:r>
+    </w:p>
+  </w:endnote>
+  <w:endnote w:type="continuationSeparator" w:id="0">
+    <w:p>
+      <w:pPr>
+        <w:spacing w:after="0" w:line="240" w:lineRule="auto"/>
+      </w:pPr>
+      <w:r>
+        <w:continuationSeparator/>
+      </w:r>
+    </w:p>
+  </w:endnote>
+</w:endnotes>
+</file>
+
+<file path=word/footnotes.xml><?xml version="1.0" encoding="utf-8"?>
+<w:footnotes xmlns:wpc="http://schemas.microsoft.com/office/word/2010/wordprocessingCanvas" xmlns:cx="http://schemas.microsoft.com/office/drawing/2014/chartex" xmlns:cx1="http://schemas.microsoft.com/office/drawing/2015/9/8/chartex" xmlns:cx2="http://schemas.microsoft.com/office/drawing/2015/10/21/chartex" xmlns:cx3="http://schemas.microsoft.com/office/drawing/2016/5/9/chartex" xmlns:cx4="http://schemas.microsoft.com/office/drawing/2016/5/10/chartex" xmlns:cx5="http://schemas.microsoft.com/office/drawing/2016/5/11/chartex" xmlns:cx6="http://schemas.microsoft.com/office/drawing/2016/5/12/chartex" xmlns:cx7="http://schemas.microsoft.com/office/drawing/2016/5/13/chartex" xmlns:cx8="http://schemas.microsoft.com/office/drawing/2016/5/14/chartex" xmlns:mc="http://schemas.openxmlformats.org/markup-compatibility/2006" xmlns:aink="http://schemas.microsoft.com/office/drawing/2016/ink" xmlns:am3d="http://schemas.microsoft.com/office/drawing/2017/model3d" xmlns:o="urn:schemas-microsoft-com:office:office" xmlns:oel="http://schemas.microsoft.com/office/2019/extlst" xmlns:r="http://schemas.openxmlformats.org/officeDocument/2006/relationships" xmlns:m="http://schemas.openxmlformats.org/officeDocument/2006/math" xmlns:v="urn:schemas-microsoft-com:vml" xmlns:wp14="http://schemas.microsoft.com/office/word/2010/wordprocessingDrawing" xmlns:wp="http://schemas.openxmlformats.org/drawingml/2006/wordprocessingDrawing" xmlns:w10="urn:schemas-microsoft-com:office:word" xmlns:w="http://schemas.openxmlformats.org/wordprocessingml/2006/main" xmlns:w14="http://schemas.microsoft.com/office/word/2010/wordml" xmlns:w15="http://schemas.microsoft.com/office/word/2012/wordml" xmlns:w16cex="http://schemas.microsoft.com/office/word/2018/wordml/cex" xmlns:w16cid="http://schemas.microsoft.com/office/word/2016/wordml/cid" xmlns:w16="http://schemas.microsoft.com/office/word/2018/wordml" xmlns:w16du="http://schemas.microsoft.com/office/word/2023/wordml/word16du" xmlns:w16sdtdh="http://schemas.microsoft.com/office/word/2020/wordml/sdtdatahash" xmlns:w16sdtfl="http://schemas.microsoft.com/office/word/2024/wordml/sdtformatlock" xmlns:w16se="http://schemas.microsoft.com/office/word/2015/wordml/symex" xmlns:wpg="http://schemas.microsoft.com/office/word/2010/wordprocessingGroup" xmlns:wpi="http://schemas.microsoft.com/office/word/2010/wordprocessingInk" xmlns:wne="http://schemas.microsoft.com/office/word/2006/wordml" xmlns:wps="http://schemas.microsoft.com/office/word/2010/wordprocessingShape" mc:Ignorable="w14 w15 w16se w16cid w16 w16cex w16sdtdh w16sdtfl w16du wp14">
+  <w:footnote w:type="separator" w:id="-1">
+    <w:p>
+      <w:pPr>
+        <w:spacing w:after="0" w:line="240" w:lineRule="auto"/>
+      </w:pPr>
+      <w:r>
+        <w:separator/>
+      </w:r>
+    </w:p>
+  </w:footnote>
+  <w:footnote w:type="continuationSeparator" w:id="0">
+    <w:p>
+      <w:pPr>
+        <w:spacing w:after="0" w:line="240" w:lineRule="auto"/>
+      </w:pPr>
+      <w:r>
+        <w:continuationSeparator/>
+      </w:r>
+    </w:p>
+  </w:footnote>
+</w:footnotes>
+</file>
+
+<file path=word/header1.xml><?xml version="1.0" encoding="utf-8"?>
+<w:hdr xmlns:wpc="http://schemas.microsoft.com/office/word/2010/wordprocessingCanvas" xmlns:cx="http://schemas.microsoft.com/office/drawing/2014/chartex" xmlns:cx1="http://schemas.microsoft.com/office/drawing/2015/9/8/chartex" xmlns:cx2="http://schemas.microsoft.com/office/drawing/2015/10/21/chartex" xmlns:cx3="http://schemas.microsoft.com/office/drawing/2016/5/9/chartex" xmlns:cx4="http://schemas.microsoft.com/office/drawing/2016/5/10/chartex" xmlns:cx5="http://schemas.microsoft.com/office/drawing/2016/5/11/chartex" xmlns:cx6="http://schemas.microsoft.com/office/drawing/2016/5/12/chartex" xmlns:cx7="http://schemas.microsoft.com/office/drawing/2016/5/13/chartex" xmlns:cx8="http://schemas.microsoft.com/office/drawing/2016/5/14/chartex" xmlns:mc="http://schemas.openxmlformats.org/markup-compatibility/2006" xmlns:aink="http://schemas.microsoft.com/office/drawing/2016/ink" xmlns:am3d="http://schemas.microsoft.com/office/drawing/2017/model3d" xmlns:o="urn:schemas-microsoft-com:office:office" xmlns:oel="http://schemas.microsoft.com/office/2019/extlst" xmlns:r="http://schemas.openxmlformats.org/officeDocument/2006/relationships" xmlns:m="http://schemas.openxmlformats.org/officeDocument/2006/math" xmlns:v="urn:schemas-microsoft-com:vml" xmlns:wp14="http://schemas.microsoft.com/office/word/2010/wordprocessingDrawing" xmlns:wp="http://schemas.openxmlformats.org/drawingml/2006/wordprocessingDrawing" xmlns:w10="urn:schemas-microsoft-com:office:word" xmlns:w="http://schemas.openxmlformats.org/wordprocessingml/2006/main" xmlns:w14="http://schemas.microsoft.com/office/word/2010/wordml" xmlns:w15="http://schemas.microsoft.com/office/word/2012/wordml" xmlns:w16cex="http://schemas.microsoft.com/office/word/2018/wordml/cex" xmlns:w16cid="http://schemas.microsoft.com/office/word/2016/wordml/cid" xmlns:w16="http://schemas.microsoft.com/office/word/2018/wordml" xmlns:w16du="http://schemas.microsoft.com/office/word/2023/wordml/word16du" xmlns:w16sdtdh="http://schemas.microsoft.com/office/word/2020/wordml/sdtdatahash" xmlns:w16sdtfl="http://schemas.microsoft.com/office/word/2024/wordml/sdtformatlock" xmlns:w16se="http://schemas.microsoft.com/office/word/2015/wordml/symex" xmlns:wpg="http://schemas.microsoft.com/office/word/2010/wordprocessingGroup" xmlns:wpi="http://schemas.microsoft.com/office/word/2010/wordprocessingInk" xmlns:wne="http://schemas.microsoft.com/office/word/2006/wordml" xmlns:wps="http://schemas.microsoft.com/office/word/2010/wordprocessingShape" mc:Ignorable="w14 w15 w16se w16cid w16 w16cex w16sdtdh w16sdtfl w16du wp14">
+  <w:p>
+    <w:pPr>
+      <w:pStyle w:val="Header"/>
+    </w:pPr>
+    <w:r>
+      <w:t>{{</w:t>
+    </w:r>
+    <w:proofErr w:type="spellStart"/>
+    <w:r>
+      <w:t>course_title</w:t>
+    </w:r>
+    <w:proofErr w:type="spellEnd"/>
+    <w:r>
+      <w:t>}}</w:t>
+    </w:r>
+  </w:p>
+  <w:p>
+    <w:pPr>
+      <w:pStyle w:val="Header"/>
+    </w:pPr>
+  </w:p>
+</w:hdr>
 </file>
 
 <file path=word/numbering.xml><?xml version="1.0" encoding="utf-8"?>

</xml_diff>

<commit_message>
Arrange spacing in the docx template
</commit_message>
<xml_diff>
--- a/updated_syllabus_detector_common_template.docx
+++ b/updated_syllabus_detector_common_template.docx
@@ -5,12 +5,13 @@
     <w:p>
       <w:pPr>
         <w:pStyle w:val="Title"/>
+        <w:jc w:val="center"/>
         <w:rPr>
           <w:rFonts w:cstheme="majorHAnsi"/>
           <w:b/>
           <w:bCs/>
-          <w:sz w:val="24"/>
-          <w:szCs w:val="24"/>
+          <w:sz w:val="40"/>
+          <w:szCs w:val="40"/>
         </w:rPr>
       </w:pPr>
       <w:r>
@@ -23,22 +24,22 @@
           <w:szCs w:val="28"/>
         </w:rPr>
         <w:drawing>
-          <wp:anchor distT="0" distB="0" distL="114300" distR="114300" simplePos="0" relativeHeight="251659264" behindDoc="0" locked="0" layoutInCell="1" allowOverlap="1" wp14:anchorId="352D9101" wp14:editId="4F1123B6">
+          <wp:anchor distT="0" distB="0" distL="114300" distR="114300" simplePos="0" relativeHeight="251659264" behindDoc="0" locked="0" layoutInCell="1" allowOverlap="1" wp14:anchorId="352D9101" wp14:editId="788A171E">
             <wp:simplePos x="0" y="0"/>
             <wp:positionH relativeFrom="margin">
-              <wp:posOffset>4130040</wp:posOffset>
+              <wp:posOffset>4519295</wp:posOffset>
             </wp:positionH>
             <wp:positionV relativeFrom="page">
-              <wp:posOffset>260350</wp:posOffset>
+              <wp:posOffset>234950</wp:posOffset>
             </wp:positionV>
-            <wp:extent cx="2378075" cy="419100"/>
-            <wp:effectExtent l="0" t="0" r="3175" b="0"/>
+            <wp:extent cx="2017395" cy="355600"/>
+            <wp:effectExtent l="0" t="0" r="1905" b="6350"/>
             <wp:wrapThrough wrapText="bothSides">
               <wp:wrapPolygon edited="0">
                 <wp:start x="0" y="0"/>
-                <wp:lineTo x="0" y="20618"/>
-                <wp:lineTo x="21456" y="20618"/>
-                <wp:lineTo x="21456" y="0"/>
+                <wp:lineTo x="0" y="20829"/>
+                <wp:lineTo x="21416" y="20829"/>
+                <wp:lineTo x="21416" y="0"/>
                 <wp:lineTo x="0" y="0"/>
               </wp:wrapPolygon>
             </wp:wrapThrough>
@@ -71,7 +72,7 @@
                   <pic:spPr bwMode="auto">
                     <a:xfrm>
                       <a:off x="0" y="0"/>
-                      <a:ext cx="2378075" cy="419100"/>
+                      <a:ext cx="2017395" cy="355600"/>
                     </a:xfrm>
                     <a:prstGeom prst="rect">
                       <a:avLst/>
@@ -90,19 +91,6 @@
           </wp:anchor>
         </w:drawing>
       </w:r>
-    </w:p>
-    <w:p>
-      <w:pPr>
-        <w:pStyle w:val="Title"/>
-        <w:jc w:val="center"/>
-        <w:rPr>
-          <w:rFonts w:cstheme="majorHAnsi"/>
-          <w:b/>
-          <w:bCs/>
-          <w:sz w:val="40"/>
-          <w:szCs w:val="40"/>
-        </w:rPr>
-      </w:pPr>
       <w:r>
         <w:rPr>
           <w:rFonts w:cstheme="majorHAnsi"/>

</xml_diff>

<commit_message>
handle all the missing fields including course details in UI
</commit_message>
<xml_diff>
--- a/updated_syllabus_detector_common_template.docx
+++ b/updated_syllabus_detector_common_template.docx
@@ -10,8 +10,8 @@
           <w:rFonts w:cstheme="majorHAnsi"/>
           <w:b/>
           <w:bCs/>
-          <w:sz w:val="40"/>
-          <w:szCs w:val="40"/>
+          <w:sz w:val="36"/>
+          <w:szCs w:val="36"/>
         </w:rPr>
       </w:pPr>
       <w:r>
@@ -20,17 +20,17 @@
           <w:bCs/>
           <w:noProof/>
           <w:color w:val="1030EB"/>
-          <w:sz w:val="28"/>
-          <w:szCs w:val="28"/>
+          <w:sz w:val="36"/>
+          <w:szCs w:val="36"/>
         </w:rPr>
         <w:drawing>
-          <wp:anchor distT="0" distB="0" distL="114300" distR="114300" simplePos="0" relativeHeight="251659264" behindDoc="0" locked="0" layoutInCell="1" allowOverlap="1" wp14:anchorId="352D9101" wp14:editId="788A171E">
+          <wp:anchor distT="0" distB="0" distL="114300" distR="114300" simplePos="0" relativeHeight="251659264" behindDoc="0" locked="0" layoutInCell="1" allowOverlap="1" wp14:anchorId="352D9101" wp14:editId="134A134E">
             <wp:simplePos x="0" y="0"/>
             <wp:positionH relativeFrom="margin">
-              <wp:posOffset>4519295</wp:posOffset>
+              <wp:posOffset>4525645</wp:posOffset>
             </wp:positionH>
             <wp:positionV relativeFrom="page">
-              <wp:posOffset>234950</wp:posOffset>
+              <wp:posOffset>406400</wp:posOffset>
             </wp:positionV>
             <wp:extent cx="2017395" cy="355600"/>
             <wp:effectExtent l="0" t="0" r="1905" b="6350"/>
@@ -96,8 +96,8 @@
           <w:rFonts w:cstheme="majorHAnsi"/>
           <w:b/>
           <w:bCs/>
-          <w:sz w:val="40"/>
-          <w:szCs w:val="40"/>
+          <w:sz w:val="36"/>
+          <w:szCs w:val="36"/>
         </w:rPr>
         <w:t>{{</w:t>
       </w:r>
@@ -107,8 +107,8 @@
           <w:rFonts w:cstheme="majorHAnsi"/>
           <w:b/>
           <w:bCs/>
-          <w:sz w:val="40"/>
-          <w:szCs w:val="40"/>
+          <w:sz w:val="36"/>
+          <w:szCs w:val="36"/>
         </w:rPr>
         <w:t>course_title</w:t>
       </w:r>
@@ -118,8 +118,8 @@
           <w:rFonts w:cstheme="majorHAnsi"/>
           <w:b/>
           <w:bCs/>
-          <w:sz w:val="40"/>
-          <w:szCs w:val="40"/>
+          <w:sz w:val="36"/>
+          <w:szCs w:val="36"/>
         </w:rPr>
         <w:t>}}</w:t>
       </w:r>
@@ -737,15 +737,6 @@
         </w:rPr>
         <w:t>{{SLOs}}</w:t>
       </w:r>
-    </w:p>
-    <w:p>
-      <w:pPr>
-        <w:pStyle w:val="NoSpacing"/>
-        <w:rPr>
-          <w:rFonts w:asciiTheme="majorHAnsi" w:hAnsiTheme="majorHAnsi" w:cstheme="majorHAnsi"/>
-          <w:bCs/>
-        </w:rPr>
-      </w:pPr>
     </w:p>
     <w:p>
       <w:pPr>

</xml_diff>

<commit_message>
Update unh image as header on first page and course details as header on other pages
</commit_message>
<xml_diff>
--- a/updated_syllabus_detector_common_template.docx
+++ b/updated_syllabus_detector_common_template.docx
@@ -16,83 +16,6 @@
       </w:pPr>
       <w:r>
         <w:rPr>
-          <w:b/>
-          <w:bCs/>
-          <w:noProof/>
-          <w:color w:val="1030EB"/>
-          <w:sz w:val="36"/>
-          <w:szCs w:val="36"/>
-        </w:rPr>
-        <w:drawing>
-          <wp:anchor distT="0" distB="0" distL="114300" distR="114300" simplePos="0" relativeHeight="251659264" behindDoc="0" locked="0" layoutInCell="1" allowOverlap="1" wp14:anchorId="352D9101" wp14:editId="134A134E">
-            <wp:simplePos x="0" y="0"/>
-            <wp:positionH relativeFrom="margin">
-              <wp:posOffset>4525645</wp:posOffset>
-            </wp:positionH>
-            <wp:positionV relativeFrom="page">
-              <wp:posOffset>406400</wp:posOffset>
-            </wp:positionV>
-            <wp:extent cx="2017395" cy="355600"/>
-            <wp:effectExtent l="0" t="0" r="1905" b="6350"/>
-            <wp:wrapThrough wrapText="bothSides">
-              <wp:wrapPolygon edited="0">
-                <wp:start x="0" y="0"/>
-                <wp:lineTo x="0" y="20829"/>
-                <wp:lineTo x="21416" y="20829"/>
-                <wp:lineTo x="21416" y="0"/>
-                <wp:lineTo x="0" y="0"/>
-              </wp:wrapPolygon>
-            </wp:wrapThrough>
-            <wp:docPr id="1115377550" name="Picture 1" descr="A blue sign with white text&#10;&#10;Description automatically generated"/>
-            <wp:cNvGraphicFramePr>
-              <a:graphicFrameLocks xmlns:a="http://schemas.openxmlformats.org/drawingml/2006/main" noChangeAspect="1"/>
-            </wp:cNvGraphicFramePr>
-            <a:graphic xmlns:a="http://schemas.openxmlformats.org/drawingml/2006/main">
-              <a:graphicData uri="http://schemas.openxmlformats.org/drawingml/2006/picture">
-                <pic:pic xmlns:pic="http://schemas.openxmlformats.org/drawingml/2006/picture">
-                  <pic:nvPicPr>
-                    <pic:cNvPr id="1115377550" name="Picture 1" descr="A blue sign with white text&#10;&#10;Description automatically generated"/>
-                    <pic:cNvPicPr>
-                      <a:picLocks noChangeAspect="1" noChangeArrowheads="1"/>
-                    </pic:cNvPicPr>
-                  </pic:nvPicPr>
-                  <pic:blipFill>
-                    <a:blip r:embed="rId8">
-                      <a:extLst>
-                        <a:ext uri="{28A0092B-C50C-407E-A947-70E740481C1C}">
-                          <a14:useLocalDpi xmlns:a14="http://schemas.microsoft.com/office/drawing/2010/main" val="0"/>
-                        </a:ext>
-                      </a:extLst>
-                    </a:blip>
-                    <a:srcRect/>
-                    <a:stretch>
-                      <a:fillRect/>
-                    </a:stretch>
-                  </pic:blipFill>
-                  <pic:spPr bwMode="auto">
-                    <a:xfrm>
-                      <a:off x="0" y="0"/>
-                      <a:ext cx="2017395" cy="355600"/>
-                    </a:xfrm>
-                    <a:prstGeom prst="rect">
-                      <a:avLst/>
-                    </a:prstGeom>
-                    <a:noFill/>
-                  </pic:spPr>
-                </pic:pic>
-              </a:graphicData>
-            </a:graphic>
-            <wp14:sizeRelH relativeFrom="margin">
-              <wp14:pctWidth>0</wp14:pctWidth>
-            </wp14:sizeRelH>
-            <wp14:sizeRelV relativeFrom="margin">
-              <wp14:pctHeight>0</wp14:pctHeight>
-            </wp14:sizeRelV>
-          </wp:anchor>
-        </w:drawing>
-      </w:r>
-      <w:r>
-        <w:rPr>
           <w:rFonts w:cstheme="majorHAnsi"/>
           <w:b/>
           <w:bCs/>
@@ -1270,10 +1193,12 @@
       </w:r>
     </w:p>
     <w:sectPr>
-      <w:headerReference w:type="default" r:id="rId9"/>
+      <w:headerReference w:type="default" r:id="rId8"/>
+      <w:headerReference w:type="first" r:id="rId9"/>
       <w:pgSz w:w="12240" w:h="15840"/>
       <w:pgMar w:top="1440" w:right="1440" w:bottom="1440" w:left="1440" w:header="720" w:footer="720" w:gutter="0"/>
       <w:cols w:space="720"/>
+      <w:titlePg/>
       <w:docGrid w:linePitch="360"/>
     </w:sectPr>
   </w:body>
@@ -1352,6 +1277,96 @@
     <w:pPr>
       <w:pStyle w:val="Header"/>
     </w:pPr>
+  </w:p>
+</w:hdr>
+</file>
+
+<file path=word/header2.xml><?xml version="1.0" encoding="utf-8"?>
+<w:hdr xmlns:wpc="http://schemas.microsoft.com/office/word/2010/wordprocessingCanvas" xmlns:cx="http://schemas.microsoft.com/office/drawing/2014/chartex" xmlns:cx1="http://schemas.microsoft.com/office/drawing/2015/9/8/chartex" xmlns:cx2="http://schemas.microsoft.com/office/drawing/2015/10/21/chartex" xmlns:cx3="http://schemas.microsoft.com/office/drawing/2016/5/9/chartex" xmlns:cx4="http://schemas.microsoft.com/office/drawing/2016/5/10/chartex" xmlns:cx5="http://schemas.microsoft.com/office/drawing/2016/5/11/chartex" xmlns:cx6="http://schemas.microsoft.com/office/drawing/2016/5/12/chartex" xmlns:cx7="http://schemas.microsoft.com/office/drawing/2016/5/13/chartex" xmlns:cx8="http://schemas.microsoft.com/office/drawing/2016/5/14/chartex" xmlns:mc="http://schemas.openxmlformats.org/markup-compatibility/2006" xmlns:aink="http://schemas.microsoft.com/office/drawing/2016/ink" xmlns:am3d="http://schemas.microsoft.com/office/drawing/2017/model3d" xmlns:o="urn:schemas-microsoft-com:office:office" xmlns:oel="http://schemas.microsoft.com/office/2019/extlst" xmlns:r="http://schemas.openxmlformats.org/officeDocument/2006/relationships" xmlns:m="http://schemas.openxmlformats.org/officeDocument/2006/math" xmlns:v="urn:schemas-microsoft-com:vml" xmlns:wp14="http://schemas.microsoft.com/office/word/2010/wordprocessingDrawing" xmlns:wp="http://schemas.openxmlformats.org/drawingml/2006/wordprocessingDrawing" xmlns:w10="urn:schemas-microsoft-com:office:word" xmlns:w="http://schemas.openxmlformats.org/wordprocessingml/2006/main" xmlns:w14="http://schemas.microsoft.com/office/word/2010/wordml" xmlns:w15="http://schemas.microsoft.com/office/word/2012/wordml" xmlns:w16cex="http://schemas.microsoft.com/office/word/2018/wordml/cex" xmlns:w16cid="http://schemas.microsoft.com/office/word/2016/wordml/cid" xmlns:w16="http://schemas.microsoft.com/office/word/2018/wordml" xmlns:w16du="http://schemas.microsoft.com/office/word/2023/wordml/word16du" xmlns:w16sdtdh="http://schemas.microsoft.com/office/word/2020/wordml/sdtdatahash" xmlns:w16sdtfl="http://schemas.microsoft.com/office/word/2024/wordml/sdtformatlock" xmlns:w16se="http://schemas.microsoft.com/office/word/2015/wordml/symex" xmlns:wpg="http://schemas.microsoft.com/office/word/2010/wordprocessingGroup" xmlns:wpi="http://schemas.microsoft.com/office/word/2010/wordprocessingInk" xmlns:wne="http://schemas.microsoft.com/office/word/2006/wordml" xmlns:wps="http://schemas.microsoft.com/office/word/2010/wordprocessingShape" mc:Ignorable="w14 w15 w16se w16cid w16 w16cex w16sdtdh w16sdtfl w16du wp14">
+  <w:p>
+    <w:pPr>
+      <w:pStyle w:val="Header"/>
+      <w:rPr>
+        <w:lang w:val="en-IN"/>
+      </w:rPr>
+    </w:pPr>
+    <w:r>
+      <w:rPr>
+        <w:b/>
+        <w:bCs/>
+        <w:noProof/>
+        <w:color w:val="1030EB"/>
+        <w:sz w:val="36"/>
+        <w:szCs w:val="36"/>
+      </w:rPr>
+      <w:drawing>
+        <wp:anchor distT="0" distB="0" distL="114300" distR="114300" simplePos="0" relativeHeight="251658240" behindDoc="0" locked="0" layoutInCell="1" allowOverlap="1" wp14:anchorId="00AE9BA3" wp14:editId="58AF0460">
+          <wp:simplePos x="0" y="0"/>
+          <wp:positionH relativeFrom="margin">
+            <wp:posOffset>4597400</wp:posOffset>
+          </wp:positionH>
+          <wp:positionV relativeFrom="page">
+            <wp:posOffset>342900</wp:posOffset>
+          </wp:positionV>
+          <wp:extent cx="2017395" cy="355600"/>
+          <wp:effectExtent l="0" t="0" r="1905" b="6350"/>
+          <wp:wrapThrough wrapText="bothSides">
+            <wp:wrapPolygon edited="0">
+              <wp:start x="0" y="0"/>
+              <wp:lineTo x="0" y="20829"/>
+              <wp:lineTo x="21416" y="20829"/>
+              <wp:lineTo x="21416" y="0"/>
+              <wp:lineTo x="0" y="0"/>
+            </wp:wrapPolygon>
+          </wp:wrapThrough>
+          <wp:docPr id="1115377550" name="Picture 1" descr="A blue sign with white text&#10;&#10;Description automatically generated"/>
+          <wp:cNvGraphicFramePr>
+            <a:graphicFrameLocks xmlns:a="http://schemas.openxmlformats.org/drawingml/2006/main" noChangeAspect="1"/>
+          </wp:cNvGraphicFramePr>
+          <a:graphic xmlns:a="http://schemas.openxmlformats.org/drawingml/2006/main">
+            <a:graphicData uri="http://schemas.openxmlformats.org/drawingml/2006/picture">
+              <pic:pic xmlns:pic="http://schemas.openxmlformats.org/drawingml/2006/picture">
+                <pic:nvPicPr>
+                  <pic:cNvPr id="1115377550" name="Picture 1" descr="A blue sign with white text&#10;&#10;Description automatically generated"/>
+                  <pic:cNvPicPr>
+                    <a:picLocks noChangeAspect="1" noChangeArrowheads="1"/>
+                  </pic:cNvPicPr>
+                </pic:nvPicPr>
+                <pic:blipFill>
+                  <a:blip r:embed="rId1">
+                    <a:extLst>
+                      <a:ext uri="{28A0092B-C50C-407E-A947-70E740481C1C}">
+                        <a14:useLocalDpi xmlns:a14="http://schemas.microsoft.com/office/drawing/2010/main" val="0"/>
+                      </a:ext>
+                    </a:extLst>
+                  </a:blip>
+                  <a:srcRect/>
+                  <a:stretch>
+                    <a:fillRect/>
+                  </a:stretch>
+                </pic:blipFill>
+                <pic:spPr bwMode="auto">
+                  <a:xfrm>
+                    <a:off x="0" y="0"/>
+                    <a:ext cx="2017395" cy="355600"/>
+                  </a:xfrm>
+                  <a:prstGeom prst="rect">
+                    <a:avLst/>
+                  </a:prstGeom>
+                  <a:noFill/>
+                </pic:spPr>
+              </pic:pic>
+            </a:graphicData>
+          </a:graphic>
+          <wp14:sizeRelH relativeFrom="margin">
+            <wp14:pctWidth>0</wp14:pctWidth>
+          </wp14:sizeRelH>
+          <wp14:sizeRelV relativeFrom="margin">
+            <wp14:pctHeight>0</wp14:pctHeight>
+          </wp14:sizeRelV>
+        </wp:anchor>
+      </w:drawing>
+    </w:r>
   </w:p>
 </w:hdr>
 </file>

</xml_diff>

<commit_message>
Remove serial numbers for the section headings from the template
</commit_message>
<xml_diff>
--- a/updated_syllabus_detector_common_template.docx
+++ b/updated_syllabus_detector_common_template.docx
@@ -22,29 +22,7 @@
           <w:sz w:val="36"/>
           <w:szCs w:val="36"/>
         </w:rPr>
-        <w:t>{{</w:t>
-      </w:r>
-      <w:proofErr w:type="spellStart"/>
-      <w:r>
-        <w:rPr>
-          <w:rFonts w:cstheme="majorHAnsi"/>
-          <w:b/>
-          <w:bCs/>
-          <w:sz w:val="36"/>
-          <w:szCs w:val="36"/>
-        </w:rPr>
-        <w:t>course_title</w:t>
-      </w:r>
-      <w:proofErr w:type="spellEnd"/>
-      <w:r>
-        <w:rPr>
-          <w:rFonts w:cstheme="majorHAnsi"/>
-          <w:b/>
-          <w:bCs/>
-          <w:sz w:val="36"/>
-          <w:szCs w:val="36"/>
-        </w:rPr>
-        <w:t>}}</w:t>
+        <w:t>{{course_title}}</w:t>
       </w:r>
     </w:p>
     <w:p>
@@ -62,7 +40,7 @@
           <w:sz w:val="24"/>
           <w:szCs w:val="24"/>
         </w:rPr>
-        <w:t>1. INSTRUCTOR INFORMATION</w:t>
+        <w:t>INSTRUCTOR INFORMATION</w:t>
       </w:r>
     </w:p>
     <w:p>
@@ -83,21 +61,7 @@
         <w:rPr>
           <w:rFonts w:asciiTheme="majorHAnsi" w:hAnsiTheme="majorHAnsi" w:cstheme="majorHAnsi"/>
         </w:rPr>
-        <w:t>{{</w:t>
-      </w:r>
-      <w:proofErr w:type="spellStart"/>
-      <w:r>
-        <w:rPr>
-          <w:rFonts w:asciiTheme="majorHAnsi" w:hAnsiTheme="majorHAnsi" w:cstheme="majorHAnsi"/>
-        </w:rPr>
-        <w:t>instructor_name</w:t>
-      </w:r>
-      <w:proofErr w:type="spellEnd"/>
-      <w:r>
-        <w:rPr>
-          <w:rFonts w:asciiTheme="majorHAnsi" w:hAnsiTheme="majorHAnsi" w:cstheme="majorHAnsi"/>
-        </w:rPr>
-        <w:t>}}</w:t>
+        <w:t>{{instructor_name}}</w:t>
       </w:r>
     </w:p>
     <w:p>
@@ -118,21 +82,7 @@
         <w:rPr>
           <w:rFonts w:asciiTheme="majorHAnsi" w:hAnsiTheme="majorHAnsi" w:cstheme="majorHAnsi"/>
         </w:rPr>
-        <w:t>{{</w:t>
-      </w:r>
-      <w:proofErr w:type="spellStart"/>
-      <w:r>
-        <w:rPr>
-          <w:rFonts w:asciiTheme="majorHAnsi" w:hAnsiTheme="majorHAnsi" w:cstheme="majorHAnsi"/>
-        </w:rPr>
-        <w:t>instructor_title</w:t>
-      </w:r>
-      <w:proofErr w:type="spellEnd"/>
-      <w:r>
-        <w:rPr>
-          <w:rFonts w:asciiTheme="majorHAnsi" w:hAnsiTheme="majorHAnsi" w:cstheme="majorHAnsi"/>
-        </w:rPr>
-        <w:t>}}</w:t>
+        <w:t>{{instructor_title}}</w:t>
       </w:r>
     </w:p>
     <w:p>
@@ -153,21 +103,7 @@
         <w:rPr>
           <w:rFonts w:asciiTheme="majorHAnsi" w:hAnsiTheme="majorHAnsi" w:cstheme="majorHAnsi"/>
         </w:rPr>
-        <w:t>{{</w:t>
-      </w:r>
-      <w:proofErr w:type="spellStart"/>
-      <w:r>
-        <w:rPr>
-          <w:rFonts w:asciiTheme="majorHAnsi" w:hAnsiTheme="majorHAnsi" w:cstheme="majorHAnsi"/>
-        </w:rPr>
-        <w:t>instructor_department</w:t>
-      </w:r>
-      <w:proofErr w:type="spellEnd"/>
-      <w:r>
-        <w:rPr>
-          <w:rFonts w:asciiTheme="majorHAnsi" w:hAnsiTheme="majorHAnsi" w:cstheme="majorHAnsi"/>
-        </w:rPr>
-        <w:t>}}</w:t>
+        <w:t>{{instructor_department}}</w:t>
       </w:r>
     </w:p>
     <w:p>
@@ -209,21 +145,7 @@
         <w:rPr>
           <w:rFonts w:asciiTheme="majorHAnsi" w:hAnsiTheme="majorHAnsi" w:cstheme="majorHAnsi"/>
         </w:rPr>
-        <w:t>{{</w:t>
-      </w:r>
-      <w:proofErr w:type="spellStart"/>
-      <w:r>
-        <w:rPr>
-          <w:rFonts w:asciiTheme="majorHAnsi" w:hAnsiTheme="majorHAnsi" w:cstheme="majorHAnsi"/>
-        </w:rPr>
-        <w:t>preferred_contact_method</w:t>
-      </w:r>
-      <w:proofErr w:type="spellEnd"/>
-      <w:r>
-        <w:rPr>
-          <w:rFonts w:asciiTheme="majorHAnsi" w:hAnsiTheme="majorHAnsi" w:cstheme="majorHAnsi"/>
-        </w:rPr>
-        <w:t>}}</w:t>
+        <w:t>{{preferred_contact_method}}</w:t>
       </w:r>
     </w:p>
     <w:p>
@@ -244,21 +166,7 @@
         <w:rPr>
           <w:rFonts w:asciiTheme="majorHAnsi" w:hAnsiTheme="majorHAnsi" w:cstheme="majorHAnsi"/>
         </w:rPr>
-        <w:t>{{</w:t>
-      </w:r>
-      <w:proofErr w:type="spellStart"/>
-      <w:r>
-        <w:rPr>
-          <w:rFonts w:asciiTheme="majorHAnsi" w:hAnsiTheme="majorHAnsi" w:cstheme="majorHAnsi"/>
-        </w:rPr>
-        <w:t>response_time</w:t>
-      </w:r>
-      <w:proofErr w:type="spellEnd"/>
-      <w:r>
-        <w:rPr>
-          <w:rFonts w:asciiTheme="majorHAnsi" w:hAnsiTheme="majorHAnsi" w:cstheme="majorHAnsi"/>
-        </w:rPr>
-        <w:t>}}</w:t>
+        <w:t>{{response_time}}</w:t>
       </w:r>
     </w:p>
     <w:p>
@@ -276,7 +184,7 @@
           <w:sz w:val="24"/>
           <w:szCs w:val="24"/>
         </w:rPr>
-        <w:t>2. OFFICE INFORMATION</w:t>
+        <w:t>OFFICE INFORMATION</w:t>
       </w:r>
     </w:p>
     <w:p>
@@ -299,23 +207,7 @@
           <w:rFonts w:asciiTheme="majorHAnsi" w:hAnsiTheme="majorHAnsi" w:cstheme="majorHAnsi"/>
           <w:bCs/>
         </w:rPr>
-        <w:t>{{</w:t>
-      </w:r>
-      <w:proofErr w:type="spellStart"/>
-      <w:r>
-        <w:rPr>
-          <w:rFonts w:asciiTheme="majorHAnsi" w:hAnsiTheme="majorHAnsi" w:cstheme="majorHAnsi"/>
-          <w:bCs/>
-        </w:rPr>
-        <w:t>office_address</w:t>
-      </w:r>
-      <w:proofErr w:type="spellEnd"/>
-      <w:r>
-        <w:rPr>
-          <w:rFonts w:asciiTheme="majorHAnsi" w:hAnsiTheme="majorHAnsi" w:cstheme="majorHAnsi"/>
-          <w:bCs/>
-        </w:rPr>
-        <w:t>}}</w:t>
+        <w:t>{{office_address}}</w:t>
       </w:r>
     </w:p>
     <w:p>
@@ -338,23 +230,7 @@
           <w:rFonts w:asciiTheme="majorHAnsi" w:hAnsiTheme="majorHAnsi" w:cstheme="majorHAnsi"/>
           <w:bCs/>
         </w:rPr>
-        <w:t>{{</w:t>
-      </w:r>
-      <w:proofErr w:type="spellStart"/>
-      <w:r>
-        <w:rPr>
-          <w:rFonts w:asciiTheme="majorHAnsi" w:hAnsiTheme="majorHAnsi" w:cstheme="majorHAnsi"/>
-          <w:bCs/>
-        </w:rPr>
-        <w:t>office_phone</w:t>
-      </w:r>
-      <w:proofErr w:type="spellEnd"/>
-      <w:r>
-        <w:rPr>
-          <w:rFonts w:asciiTheme="majorHAnsi" w:hAnsiTheme="majorHAnsi" w:cstheme="majorHAnsi"/>
-          <w:bCs/>
-        </w:rPr>
-        <w:t>}}</w:t>
+        <w:t>{{office_phone}}</w:t>
       </w:r>
     </w:p>
     <w:p>
@@ -377,23 +253,7 @@
           <w:rFonts w:asciiTheme="majorHAnsi" w:hAnsiTheme="majorHAnsi" w:cstheme="majorHAnsi"/>
           <w:bCs/>
         </w:rPr>
-        <w:t>{{</w:t>
-      </w:r>
-      <w:proofErr w:type="spellStart"/>
-      <w:r>
-        <w:rPr>
-          <w:rFonts w:asciiTheme="majorHAnsi" w:hAnsiTheme="majorHAnsi" w:cstheme="majorHAnsi"/>
-          <w:bCs/>
-        </w:rPr>
-        <w:t>office_hours</w:t>
-      </w:r>
-      <w:proofErr w:type="spellEnd"/>
-      <w:r>
-        <w:rPr>
-          <w:rFonts w:asciiTheme="majorHAnsi" w:hAnsiTheme="majorHAnsi" w:cstheme="majorHAnsi"/>
-          <w:bCs/>
-        </w:rPr>
-        <w:t>}}</w:t>
+        <w:t>{{office_hours}}</w:t>
       </w:r>
     </w:p>
     <w:p>
@@ -411,7 +271,7 @@
           <w:sz w:val="24"/>
           <w:szCs w:val="24"/>
         </w:rPr>
-        <w:t>3. COURSE CONTEXT</w:t>
+        <w:t>COURSE CONTEXT</w:t>
       </w:r>
     </w:p>
     <w:p>
@@ -457,23 +317,7 @@
           <w:rFonts w:asciiTheme="majorHAnsi" w:hAnsiTheme="majorHAnsi" w:cstheme="majorHAnsi"/>
           <w:bCs/>
         </w:rPr>
-        <w:t>{{</w:t>
-      </w:r>
-      <w:proofErr w:type="spellStart"/>
-      <w:r>
-        <w:rPr>
-          <w:rFonts w:asciiTheme="majorHAnsi" w:hAnsiTheme="majorHAnsi" w:cstheme="majorHAnsi"/>
-          <w:bCs/>
-        </w:rPr>
-        <w:t>class_location</w:t>
-      </w:r>
-      <w:proofErr w:type="spellEnd"/>
-      <w:r>
-        <w:rPr>
-          <w:rFonts w:asciiTheme="majorHAnsi" w:hAnsiTheme="majorHAnsi" w:cstheme="majorHAnsi"/>
-          <w:bCs/>
-        </w:rPr>
-        <w:t>}}</w:t>
+        <w:t>{{class_location}}</w:t>
       </w:r>
     </w:p>
     <w:p>
@@ -491,7 +335,7 @@
           <w:sz w:val="24"/>
           <w:szCs w:val="24"/>
         </w:rPr>
-        <w:t>4. ASSIGNMENT POLICIES</w:t>
+        <w:t>ASSIGNMENT POLICIES</w:t>
       </w:r>
     </w:p>
     <w:p>
@@ -514,23 +358,7 @@
           <w:rFonts w:asciiTheme="majorHAnsi" w:hAnsiTheme="majorHAnsi" w:cstheme="majorHAnsi"/>
           <w:bCs/>
         </w:rPr>
-        <w:t>{{</w:t>
-      </w:r>
-      <w:proofErr w:type="spellStart"/>
-      <w:r>
-        <w:rPr>
-          <w:rFonts w:asciiTheme="majorHAnsi" w:hAnsiTheme="majorHAnsi" w:cstheme="majorHAnsi"/>
-          <w:bCs/>
-        </w:rPr>
-        <w:t>assignment_types_title</w:t>
-      </w:r>
-      <w:proofErr w:type="spellEnd"/>
-      <w:r>
-        <w:rPr>
-          <w:rFonts w:asciiTheme="majorHAnsi" w:hAnsiTheme="majorHAnsi" w:cstheme="majorHAnsi"/>
-          <w:bCs/>
-        </w:rPr>
-        <w:t>}}</w:t>
+        <w:t>{{assignment_types_title}}</w:t>
       </w:r>
     </w:p>
     <w:p>
@@ -553,23 +381,7 @@
           <w:rFonts w:asciiTheme="majorHAnsi" w:hAnsiTheme="majorHAnsi" w:cstheme="majorHAnsi"/>
           <w:bCs/>
         </w:rPr>
-        <w:t>{{</w:t>
-      </w:r>
-      <w:proofErr w:type="spellStart"/>
-      <w:r>
-        <w:rPr>
-          <w:rFonts w:asciiTheme="majorHAnsi" w:hAnsiTheme="majorHAnsi" w:cstheme="majorHAnsi"/>
-          <w:bCs/>
-        </w:rPr>
-        <w:t>assignment_delivery</w:t>
-      </w:r>
-      <w:proofErr w:type="spellEnd"/>
-      <w:r>
-        <w:rPr>
-          <w:rFonts w:asciiTheme="majorHAnsi" w:hAnsiTheme="majorHAnsi" w:cstheme="majorHAnsi"/>
-          <w:bCs/>
-        </w:rPr>
-        <w:t>}}</w:t>
+        <w:t>{{assignment_delivery}}</w:t>
       </w:r>
     </w:p>
     <w:p>
@@ -592,23 +404,7 @@
           <w:rFonts w:asciiTheme="majorHAnsi" w:hAnsiTheme="majorHAnsi" w:cstheme="majorHAnsi"/>
           <w:bCs/>
         </w:rPr>
-        <w:t>{{</w:t>
-      </w:r>
-      <w:proofErr w:type="spellStart"/>
-      <w:r>
-        <w:rPr>
-          <w:rFonts w:asciiTheme="majorHAnsi" w:hAnsiTheme="majorHAnsi" w:cstheme="majorHAnsi"/>
-          <w:bCs/>
-        </w:rPr>
-        <w:t>deadline_expectations_title</w:t>
-      </w:r>
-      <w:proofErr w:type="spellEnd"/>
-      <w:r>
-        <w:rPr>
-          <w:rFonts w:asciiTheme="majorHAnsi" w:hAnsiTheme="majorHAnsi" w:cstheme="majorHAnsi"/>
-          <w:bCs/>
-        </w:rPr>
-        <w:t>}}</w:t>
+        <w:t>{{deadline_expectations_title}}</w:t>
       </w:r>
     </w:p>
     <w:p>
@@ -626,7 +422,7 @@
           <w:sz w:val="24"/>
           <w:szCs w:val="24"/>
         </w:rPr>
-        <w:t>5. STUDENT EXPECTATIONS</w:t>
+        <w:t>STUDENT EXPECTATIONS</w:t>
       </w:r>
     </w:p>
     <w:p>
@@ -681,23 +477,7 @@
           <w:rFonts w:asciiTheme="majorHAnsi" w:hAnsiTheme="majorHAnsi" w:cstheme="majorHAnsi"/>
           <w:bCs/>
         </w:rPr>
-        <w:t>{{</w:t>
-      </w:r>
-      <w:proofErr w:type="spellStart"/>
-      <w:r>
-        <w:rPr>
-          <w:rFonts w:asciiTheme="majorHAnsi" w:hAnsiTheme="majorHAnsi" w:cstheme="majorHAnsi"/>
-          <w:bCs/>
-        </w:rPr>
-        <w:t>credit_hour</w:t>
-      </w:r>
-      <w:proofErr w:type="spellEnd"/>
-      <w:r>
-        <w:rPr>
-          <w:rFonts w:asciiTheme="majorHAnsi" w:hAnsiTheme="majorHAnsi" w:cstheme="majorHAnsi"/>
-          <w:bCs/>
-        </w:rPr>
-        <w:t>}}</w:t>
+        <w:t>{{credit_hour}}</w:t>
       </w:r>
     </w:p>
     <w:p>
@@ -745,7 +525,7 @@
           <w:sz w:val="24"/>
           <w:szCs w:val="24"/>
         </w:rPr>
-        <w:t>6. GRADING INFORMATION</w:t>
+        <w:t>GRADING INFORMATION</w:t>
       </w:r>
     </w:p>
     <w:p>
@@ -777,23 +557,7 @@
           <w:rFonts w:asciiTheme="majorHAnsi" w:hAnsiTheme="majorHAnsi" w:cstheme="majorHAnsi"/>
           <w:bCs/>
         </w:rPr>
-        <w:t>{{</w:t>
-      </w:r>
-      <w:proofErr w:type="spellStart"/>
-      <w:r>
-        <w:rPr>
-          <w:rFonts w:asciiTheme="majorHAnsi" w:hAnsiTheme="majorHAnsi" w:cstheme="majorHAnsi"/>
-          <w:bCs/>
-        </w:rPr>
-        <w:t>final_grade_scale</w:t>
-      </w:r>
-      <w:proofErr w:type="spellEnd"/>
-      <w:r>
-        <w:rPr>
-          <w:rFonts w:asciiTheme="majorHAnsi" w:hAnsiTheme="majorHAnsi" w:cstheme="majorHAnsi"/>
-          <w:bCs/>
-        </w:rPr>
-        <w:t>}}</w:t>
+        <w:t>{{final_grade_scale}}</w:t>
       </w:r>
     </w:p>
     <w:p>
@@ -834,23 +598,7 @@
           <w:rFonts w:asciiTheme="majorHAnsi" w:hAnsiTheme="majorHAnsi" w:cstheme="majorHAnsi"/>
           <w:bCs/>
         </w:rPr>
-        <w:t>{{</w:t>
-      </w:r>
-      <w:proofErr w:type="spellStart"/>
-      <w:r>
-        <w:rPr>
-          <w:rFonts w:asciiTheme="majorHAnsi" w:hAnsiTheme="majorHAnsi" w:cstheme="majorHAnsi"/>
-          <w:bCs/>
-        </w:rPr>
-        <w:t>grading_process</w:t>
-      </w:r>
-      <w:proofErr w:type="spellEnd"/>
-      <w:r>
-        <w:rPr>
-          <w:rFonts w:asciiTheme="majorHAnsi" w:hAnsiTheme="majorHAnsi" w:cstheme="majorHAnsi"/>
-          <w:bCs/>
-        </w:rPr>
-        <w:t>}}</w:t>
+        <w:t>{{grading_process}}</w:t>
       </w:r>
     </w:p>
     <w:p>
@@ -869,7 +617,7 @@
           <w:szCs w:val="24"/>
         </w:rPr>
         <w:lastRenderedPageBreak/>
-        <w:t>7. ACADEMIC HONESTY</w:t>
+        <w:t>ACADEMIC HONESTY</w:t>
       </w:r>
     </w:p>
     <w:p>
@@ -929,7 +677,7 @@
           <w:sz w:val="24"/>
           <w:szCs w:val="24"/>
         </w:rPr>
-        <w:t>8. STUDENTS WITH DISABILITIES</w:t>
+        <w:t>STUDENTS WITH DISABILITIES</w:t>
       </w:r>
     </w:p>
     <w:p>
@@ -961,7 +709,7 @@
           <w:sz w:val="24"/>
           <w:szCs w:val="24"/>
         </w:rPr>
-        <w:t>9. EMOTIONAL OR MENTAL HEALTH DISTRESS</w:t>
+        <w:t>EMOTIONAL OR MENTAL HEALTH DISTRESS</w:t>
       </w:r>
     </w:p>
     <w:p>
@@ -1063,7 +811,7 @@
           <w:sz w:val="24"/>
           <w:szCs w:val="24"/>
         </w:rPr>
-        <w:t>10. CONFIDENTIALITY AND MANDATORY REPORTING OF SEXUAL VIOLENCE AND HARASSMENT</w:t>
+        <w:t>CONFIDENTIALITY AND MANDATORY REPORTING OF SEXUAL VIOLENCE AND HARASSMENT</w:t>
       </w:r>
     </w:p>
     <w:p>
@@ -1077,14 +825,14 @@
         <w:rPr>
           <w:rFonts w:asciiTheme="majorHAnsi" w:hAnsiTheme="majorHAnsi" w:cstheme="majorHAnsi"/>
         </w:rPr>
-        <w:t xml:space="preserve">The University of New Hampshire at Manchester and its community are committed to assuring a safe and productive educational environment for all students. Title IX makes it clear that violence, </w:t>
+        <w:t xml:space="preserve">The University of New Hampshire at Manchester and its community are committed to assuring a safe and productive educational environment for all students. Title IX makes it clear that violence, harassment, and discrimination based on sex and gender are civil rights offenses subject to the same </w:t>
       </w:r>
       <w:r>
         <w:rPr>
           <w:rFonts w:asciiTheme="majorHAnsi" w:hAnsiTheme="majorHAnsi" w:cstheme="majorHAnsi"/>
         </w:rPr>
         <w:lastRenderedPageBreak/>
-        <w:t>harassment, and discrimination based on sex and gender are civil rights offenses subject to the same kinds of accountability and support applied to offenses against other protected categories such as race, national origin, and ability.</w:t>
+        <w:t>kinds of accountability and support applied to offenses against other protected categories such as race, national origin, and ability.</w:t>
       </w:r>
     </w:p>
     <w:p>
@@ -1262,15 +1010,7 @@
       <w:pStyle w:val="Header"/>
     </w:pPr>
     <w:r>
-      <w:t>{{</w:t>
-    </w:r>
-    <w:proofErr w:type="spellStart"/>
-    <w:r>
-      <w:t>course_title</w:t>
-    </w:r>
-    <w:proofErr w:type="spellEnd"/>
-    <w:r>
-      <w:t>}}</w:t>
+      <w:t>{{course_title}}</w:t>
     </w:r>
   </w:p>
   <w:p>

</xml_diff>